<commit_message>
Simplify speech text for easier reading aloud at defense
Co-authored-by: emikateam-coder <emikateam-coder@users.noreply.github.com>
</commit_message>
<xml_diff>
--- a/Речь_к_защите_Остапенко.docx
+++ b/Речь_к_защите_Остапенко.docx
@@ -25,7 +25,7 @@
           <w:b/>
           <w:sz w:val="28"/>
         </w:rPr>
-        <w:t>«Организация рекламно-информационной работы коммерческой организации и оценка её эффективности (на примере ООО "ФАСТ ИНЖИНИРИНГ")»</w:t>
+        <w:t>«Организация рекламно-информационной работы</w:t>
       </w:r>
     </w:p>
     <w:p>
@@ -38,7 +38,7 @@
           <w:b/>
           <w:sz w:val="28"/>
         </w:rPr>
-        <w:t>Студент: Остапенко Михаил Дмитриевич</w:t>
+        <w:t>коммерческой организации и оценка её эффективности</w:t>
       </w:r>
     </w:p>
     <w:p>
@@ -51,14 +51,11 @@
           <w:b/>
           <w:sz w:val="28"/>
         </w:rPr>
-        <w:t>Специальность: 38.02.04 Коммерция (по отраслям)</w:t>
+        <w:t>(на примере ООО "ФАСТ ИНЖИНИРИНГ")»</w:t>
       </w:r>
     </w:p>
     <w:p/>
     <w:p>
-      <w:pPr>
-        <w:jc w:val="left"/>
-      </w:pPr>
       <w:r>
         <w:rPr>
           <w:rFonts w:ascii="Times New Roman" w:hAnsi="Times New Roman"/>
@@ -66,7 +63,7 @@
           <w:color w:val="1F498B"/>
           <w:sz w:val="28"/>
         </w:rPr>
-        <w:t xml:space="preserve">[Слайд 1] </w:t>
+        <w:t>[Слайд 1]</w:t>
       </w:r>
       <w:r>
         <w:rPr>
@@ -75,12 +72,12 @@
           <w:color w:val="1F498B"/>
           <w:sz w:val="28"/>
         </w:rPr>
-        <w:t>— Титульный слайд</w:t>
+        <w:t xml:space="preserve">  Титульный слайд</w:t>
       </w:r>
     </w:p>
     <w:p>
       <w:pPr>
-        <w:spacing w:after="0"/>
+        <w:spacing w:after="80"/>
         <w:ind w:firstLine="709"/>
         <w:jc w:val="both"/>
       </w:pPr>
@@ -89,12 +86,12 @@
           <w:rFonts w:ascii="Times New Roman" w:hAnsi="Times New Roman"/>
           <w:sz w:val="28"/>
         </w:rPr>
-        <w:t>Уважаемый Председатель и уважаемые члены Государственной Аттестационной Комиссии!</w:t>
+        <w:t>Уважаемый Председатель, уважаемые члены Государственной Аттестационной Комиссии!</w:t>
       </w:r>
     </w:p>
     <w:p>
       <w:pPr>
-        <w:spacing w:after="0"/>
+        <w:spacing w:after="80"/>
         <w:ind w:firstLine="709"/>
         <w:jc w:val="both"/>
       </w:pPr>
@@ -103,12 +100,12 @@
           <w:rFonts w:ascii="Times New Roman" w:hAnsi="Times New Roman"/>
           <w:sz w:val="28"/>
         </w:rPr>
-        <w:t>Вашему вниманию представляется дипломная работа на тему: «Организация рекламно-информационной работы коммерческой организации и оценка её эффективности (на примере ООО "ФАСТ ИНЖИНИРИНГ")».</w:t>
+        <w:t>Вашему вниманию представляется дипломная работа на тему: «Организация рекламно-информационной работы коммерческой организации и оценка её эффективности» — на примере ООО «ФАСТ ИНЖИНИРИНГ».</w:t>
       </w:r>
     </w:p>
     <w:p>
       <w:pPr>
-        <w:spacing w:after="0"/>
+        <w:spacing w:after="80"/>
         <w:ind w:firstLine="709"/>
         <w:jc w:val="both"/>
       </w:pPr>
@@ -117,14 +114,11 @@
           <w:rFonts w:ascii="Times New Roman" w:hAnsi="Times New Roman"/>
           <w:sz w:val="28"/>
         </w:rPr>
-        <w:t>Научный руководитель — кандидат экономических наук, доцент Саенко Мария Юрьевна.</w:t>
+        <w:t>Научный руководитель — к.э.н., доцент Саенко Мария Юрьевна.</w:t>
       </w:r>
     </w:p>
     <w:p/>
     <w:p>
-      <w:pPr>
-        <w:jc w:val="left"/>
-      </w:pPr>
       <w:r>
         <w:rPr>
           <w:rFonts w:ascii="Times New Roman" w:hAnsi="Times New Roman"/>
@@ -132,7 +126,7 @@
           <w:color w:val="1F498B"/>
           <w:sz w:val="28"/>
         </w:rPr>
-        <w:t xml:space="preserve">[Слайд 2] </w:t>
+        <w:t>[Слайд 2]</w:t>
       </w:r>
       <w:r>
         <w:rPr>
@@ -141,12 +135,12 @@
           <w:color w:val="1F498B"/>
           <w:sz w:val="28"/>
         </w:rPr>
-        <w:t>— Актуальность, объект, предмет, цель и задачи</w:t>
+        <w:t xml:space="preserve">  Актуальность, цель и задачи</w:t>
       </w:r>
     </w:p>
     <w:p>
       <w:pPr>
-        <w:spacing w:after="0"/>
+        <w:spacing w:after="80"/>
         <w:ind w:firstLine="709"/>
         <w:jc w:val="both"/>
       </w:pPr>
@@ -155,12 +149,12 @@
           <w:rFonts w:ascii="Times New Roman" w:hAnsi="Times New Roman"/>
           <w:sz w:val="28"/>
         </w:rPr>
-        <w:t>Актуальность темы обусловлена тремя группами факторов. Во-первых, экономическим: государственный курс на технологический суверенитет повысил роль отечественных инжиниринговых компаний, однако технологическое превосходство не гарантирует коммерческого успеха без грамотно выстроенной рекламно-информационной работы. Во-вторых, регуляторным: поправки 2022–2023 годов к Федеральному закону №38-ФЗ «О рекламе» — обязательная маркировка и Единый реестр интернет-рекламы — сделали грамотную организацию рекламной деятельности самостоятельным фактором устойчивости бизнеса. В-третьих, методическим: инструментарий оценки эффективности рекламно-информационной работы микропредприятий B2B-сегмента с длительным циклом сделки остаётся недостаточно разработанным в научной литературе.</w:t>
+        <w:t>Почему эта тема важна? Три причины.</w:t>
       </w:r>
     </w:p>
     <w:p>
       <w:pPr>
-        <w:spacing w:after="0"/>
+        <w:spacing w:after="80"/>
         <w:ind w:firstLine="709"/>
         <w:jc w:val="both"/>
       </w:pPr>
@@ -169,12 +163,12 @@
           <w:rFonts w:ascii="Times New Roman" w:hAnsi="Times New Roman"/>
           <w:sz w:val="28"/>
         </w:rPr>
-        <w:t>Объектом исследования является рекламно-информационная деятельность ООО «ФАСТ ИНЖИНИРИНГ», предметом — организационно-экономические отношения, возникающие в процессе её планирования, реализации и оценки эффективности.</w:t>
+        <w:t>Первая — экономическая. Российские инжиниринговые компании сейчас на подъёме из-за курса на импортозамещение. Но хорошей продукции мало — её нужно ещё и продвигать.</w:t>
       </w:r>
     </w:p>
     <w:p>
       <w:pPr>
-        <w:spacing w:after="0"/>
+        <w:spacing w:after="80"/>
         <w:ind w:firstLine="709"/>
         <w:jc w:val="both"/>
       </w:pPr>
@@ -183,14 +177,39 @@
           <w:rFonts w:ascii="Times New Roman" w:hAnsi="Times New Roman"/>
           <w:sz w:val="28"/>
         </w:rPr>
-        <w:t>Цель работы — разработка обоснованных предложений по совершенствованию рекламно-информационной работы предприятия и оценка их экономической и коммуникативной эффективности. Для достижения этой цели решены восемь задач, охватывающих теоретические основы, анализ текущей деятельности, разработку программы совершенствования и её экономическое обоснование.</w:t>
+        <w:t>Вторая — правовая. В 2022–2023 годах в закон «О рекламе» внесли серьёзные поправки: обязательная маркировка интернет-рекламы, Единый реестр. Это уже не опция, а требование.</w:t>
+      </w:r>
+    </w:p>
+    <w:p>
+      <w:pPr>
+        <w:spacing w:after="80"/>
+        <w:ind w:firstLine="709"/>
+        <w:jc w:val="both"/>
+      </w:pPr>
+      <w:r>
+        <w:rPr>
+          <w:rFonts w:ascii="Times New Roman" w:hAnsi="Times New Roman"/>
+          <w:sz w:val="28"/>
+        </w:rPr>
+        <w:t>Третья — научная. Для небольших B2B-компаний с долгим циклом сделки нормальной методики оценки рекламы практически нет. Мы её разработали.</w:t>
+      </w:r>
+    </w:p>
+    <w:p>
+      <w:pPr>
+        <w:spacing w:after="80"/>
+        <w:ind w:firstLine="709"/>
+        <w:jc w:val="both"/>
+      </w:pPr>
+      <w:r>
+        <w:rPr>
+          <w:rFonts w:ascii="Times New Roman" w:hAnsi="Times New Roman"/>
+          <w:sz w:val="28"/>
+        </w:rPr>
+        <w:t>Объект исследования — рекламно-информационная деятельность ООО «ФАСТ ИНЖИНИРИНГ». Цель — разработать конкретные предложения по её улучшению и посчитать, насколько они окупятся.</w:t>
       </w:r>
     </w:p>
     <w:p/>
     <w:p>
-      <w:pPr>
-        <w:jc w:val="left"/>
-      </w:pPr>
       <w:r>
         <w:rPr>
           <w:rFonts w:ascii="Times New Roman" w:hAnsi="Times New Roman"/>
@@ -198,7 +217,7 @@
           <w:color w:val="1F498B"/>
           <w:sz w:val="28"/>
         </w:rPr>
-        <w:t xml:space="preserve">[Слайд 3] </w:t>
+        <w:t>[Слайд 3]</w:t>
       </w:r>
       <w:r>
         <w:rPr>
@@ -207,12 +226,12 @@
           <w:color w:val="1F498B"/>
           <w:sz w:val="28"/>
         </w:rPr>
-        <w:t>— Характеристика объекта исследования</w:t>
+        <w:t xml:space="preserve">  Объект исследования — ООО «ФАСТ ИНЖИНИРИНГ»</w:t>
       </w:r>
     </w:p>
     <w:p>
       <w:pPr>
-        <w:spacing w:after="0"/>
+        <w:spacing w:after="80"/>
         <w:ind w:firstLine="709"/>
         <w:jc w:val="both"/>
       </w:pPr>
@@ -221,12 +240,12 @@
           <w:rFonts w:ascii="Times New Roman" w:hAnsi="Times New Roman"/>
           <w:sz w:val="28"/>
         </w:rPr>
-        <w:t>ООО «ФАСТ ИНЖИНИРИНГ» — это московское микропредприятие (численность до 10 человек), основанное в 1991 году и юридически зарегистрированное в 2001 году. Предприятие специализируется на разработке, проектировании и поставке инновационной промышленной продукции: радиально-спиральных теплообменных и массообменных аппаратов, каталитических реакторов нового поколения, беспламенных горелок и водородных аккумуляторов.</w:t>
+        <w:t>Чем занимается компания? Это небольшое московское предприятие — до 10 человек. Разрабатывает и поставляет промышленное оборудование: теплообменники, массообменные аппараты, каталитические реакторы, беспламенные горелки.</w:t>
       </w:r>
     </w:p>
     <w:p>
       <w:pPr>
-        <w:spacing w:after="0"/>
+        <w:spacing w:after="80"/>
         <w:ind w:firstLine="709"/>
         <w:jc w:val="both"/>
       </w:pPr>
@@ -235,14 +254,25 @@
           <w:rFonts w:ascii="Times New Roman" w:hAnsi="Times New Roman"/>
           <w:sz w:val="28"/>
         </w:rPr>
-        <w:t>Компания обладает значительным научным и производственным потенциалом: все разработки защищены патентами Российской Федерации. В январе 2026 года предприятие получило статус Малой технологической компании Министерства экономического развития, является лауреатом Премии Мэра Москвы «Новатор Москвы» и финалистом конкурса GREENTECH фонда «Сколково» в 2024–2025 годах. В числе ключевых заказчиков — ПАО «НОВАТЭК», ПАО «ЕВРОХИМ», АО «ТАНЕКО», ПАО «МОСЭНЕРГО», АО «Воркутауголь».</w:t>
+        <w:t>Компания очень сильна технически. Все разработки запатентованы. Среди клиентов — НОВАТЭК, ЕВРОХИМ, ТАНЕКО, МОСЭНЕРГО. В 2026 году получила статус Малой технологической компании от Минэкономразвития. Лауреат премии «Новатор Москвы», финалист «Сколково».</w:t>
+      </w:r>
+    </w:p>
+    <w:p>
+      <w:pPr>
+        <w:spacing w:after="80"/>
+        <w:ind w:firstLine="709"/>
+        <w:jc w:val="both"/>
+      </w:pPr>
+      <w:r>
+        <w:rPr>
+          <w:rFonts w:ascii="Times New Roman" w:hAnsi="Times New Roman"/>
+          <w:sz w:val="28"/>
+        </w:rPr>
+        <w:t>Казалось бы — сильная компания. Но есть серьёзная проблема.</w:t>
       </w:r>
     </w:p>
     <w:p/>
     <w:p>
-      <w:pPr>
-        <w:jc w:val="left"/>
-      </w:pPr>
       <w:r>
         <w:rPr>
           <w:rFonts w:ascii="Times New Roman" w:hAnsi="Times New Roman"/>
@@ -250,7 +280,7 @@
           <w:color w:val="1F498B"/>
           <w:sz w:val="28"/>
         </w:rPr>
-        <w:t xml:space="preserve">[Слайд 4] </w:t>
+        <w:t>[Слайд 4]</w:t>
       </w:r>
       <w:r>
         <w:rPr>
@@ -259,12 +289,12 @@
           <w:color w:val="1F498B"/>
           <w:sz w:val="28"/>
         </w:rPr>
-        <w:t>— Проблема: выручка упала на 80,4% — причина сбытовая</w:t>
+        <w:t xml:space="preserve">  Проблема: выручка упала на 80,4%</w:t>
       </w:r>
     </w:p>
     <w:p>
       <w:pPr>
-        <w:spacing w:after="0"/>
+        <w:spacing w:after="80"/>
         <w:ind w:firstLine="709"/>
         <w:jc w:val="both"/>
       </w:pPr>
@@ -273,12 +303,12 @@
           <w:rFonts w:ascii="Times New Roman" w:hAnsi="Times New Roman"/>
           <w:sz w:val="28"/>
         </w:rPr>
-        <w:t>Финансово-экономический анализ за 2023–2025 годы зафиксировал острый сбытовой кризис. Выручка компании снизилась с 5 605 тысяч рублей в 2023 году до 375 тысяч рублей в 2024 году — падение на 80,4%, и прибыль была обнулена. В 2025 году наблюдается частичное восстановление до уровня около 1 100 тысяч рублей, однако докризисные показатели ещё не достигнуты.</w:t>
+        <w:t>Смотрите на цифры. В 2023 году выручка — 5 605 тысяч рублей. В 2024 году — всего 375 тысяч. Падение в 15 раз. Прибыль — ноль. В 2025-м небольшое восстановление до 1 100 тысяч, но до уровня 2023 года ещё далеко.</w:t>
       </w:r>
     </w:p>
     <w:p>
       <w:pPr>
-        <w:spacing w:after="0"/>
+        <w:spacing w:after="80"/>
         <w:ind w:firstLine="709"/>
         <w:jc w:val="both"/>
       </w:pPr>
@@ -287,14 +317,25 @@
           <w:rFonts w:ascii="Times New Roman" w:hAnsi="Times New Roman"/>
           <w:sz w:val="28"/>
         </w:rPr>
-        <w:t>Принципиальный вывод анализа: причина кризиса носит не операционный, а сбытовой характер. Диагностика показала, что производственный и научный потенциал предприятия полностью сохранён — стабильный кадровый состав, действующие патенты, высокая техническая экспертиза. Однако маркетинговая функция отсутствует, стратегия продвижения не разработана, системный поток заказов не сформирован. Компания использует лишь 2 из 6 возможных маркетинговых инструментов, узнаваемость в отрасли составляет около 38%, а среднее число входящих обращений — порядка 3 в месяц.</w:t>
+        <w:t>Мы проверили: производство работает, люди на месте, патенты действуют. Значит, дело не в производстве. Дело в том, что компанию просто не знают и не находят.</w:t>
+      </w:r>
+    </w:p>
+    <w:p>
+      <w:pPr>
+        <w:spacing w:after="80"/>
+        <w:ind w:firstLine="709"/>
+        <w:jc w:val="both"/>
+      </w:pPr>
+      <w:r>
+        <w:rPr>
+          <w:rFonts w:ascii="Times New Roman" w:hAnsi="Times New Roman"/>
+          <w:sz w:val="28"/>
+        </w:rPr>
+        <w:t>Конкретные факты: узнаваемость в отрасли — 38%. Входящих обращений — около 3 в месяц. Используется только 2 маркетинговых инструмента из 6 возможных. Вывод: кризис — сбытовой, и его причина — в рекламе.</w:t>
       </w:r>
     </w:p>
     <w:p/>
     <w:p>
-      <w:pPr>
-        <w:jc w:val="left"/>
-      </w:pPr>
       <w:r>
         <w:rPr>
           <w:rFonts w:ascii="Times New Roman" w:hAnsi="Times New Roman"/>
@@ -302,7 +343,7 @@
           <w:color w:val="1F498B"/>
           <w:sz w:val="28"/>
         </w:rPr>
-        <w:t xml:space="preserve">[Слайд 5] </w:t>
+        <w:t>[Слайд 5]</w:t>
       </w:r>
       <w:r>
         <w:rPr>
@@ -311,12 +352,12 @@
           <w:color w:val="1F498B"/>
           <w:sz w:val="28"/>
         </w:rPr>
-        <w:t>— SWOT-анализ рекламно-информационной работы</w:t>
+        <w:t xml:space="preserve">  SWOT-анализ</w:t>
       </w:r>
     </w:p>
     <w:p>
       <w:pPr>
-        <w:spacing w:after="0"/>
+        <w:spacing w:after="80"/>
         <w:ind w:firstLine="709"/>
         <w:jc w:val="both"/>
       </w:pPr>
@@ -325,12 +366,12 @@
           <w:rFonts w:ascii="Times New Roman" w:hAnsi="Times New Roman"/>
           <w:sz w:val="28"/>
         </w:rPr>
-        <w:t>В рамках второй главы проведён детальный SWOT-анализ системы рекламно-информационной работы предприятия. К сильным сторонам относятся: уникальная патентованная продукция, высокий уровень технической экспертизы, статус резидента «Сколково» и лауреата «Новатор Москвы», наличие реальных крупных промышленных заказчиков. Слабые стороны — отсутствие выделенной маркетинговой функции, сайт устаревшей архитектуры без CRM, продвижение исключительно через личные контакты руководителя, отсутствие структурированного референс-листа проектов.</w:t>
+        <w:t>Мы провели SWOT-анализ рекламно-информационной работы.</w:t>
       </w:r>
     </w:p>
     <w:p>
       <w:pPr>
-        <w:spacing w:after="0"/>
+        <w:spacing w:after="80"/>
         <w:ind w:firstLine="709"/>
         <w:jc w:val="both"/>
       </w:pPr>
@@ -339,14 +380,25 @@
           <w:rFonts w:ascii="Times New Roman" w:hAnsi="Times New Roman"/>
           <w:sz w:val="28"/>
         </w:rPr>
-        <w:t>Среди возможностей — растущий спрос на импортозамещающие решения, доступность цифровых каналов (SEO, Яндекс.Директ), участие в отраслевых выставках и конференциях, развитие контент-маркетинга через Telegram. Угрозы: длительный B2B-цикл сделки, регуляторные требования к интернет-рекламе, высокая конкуренция в инжиниринге, критическая зависимость продаж от одного человека — первого лица компании.</w:t>
+        <w:t>Сильные стороны: уникальный продукт, патенты, крупные клиенты, премии и статусы. Слабые: нет маркетолога, сайт устаревший, нет CRM, нет референс-листа проектов, всё продвижение — через личные контакты директора.</w:t>
+      </w:r>
+    </w:p>
+    <w:p>
+      <w:pPr>
+        <w:spacing w:after="80"/>
+        <w:ind w:firstLine="709"/>
+        <w:jc w:val="both"/>
+      </w:pPr>
+      <w:r>
+        <w:rPr>
+          <w:rFonts w:ascii="Times New Roman" w:hAnsi="Times New Roman"/>
+          <w:sz w:val="28"/>
+        </w:rPr>
+        <w:t>Возможности: импортозамещение даёт рост спроса, цифровые каналы доступны — SEO, Яндекс.Директ, Telegram. Угрозы: конкуренция растёт, цикл сделки длинный, и если директор заболеет — заказов не будет вообще.</w:t>
       </w:r>
     </w:p>
     <w:p/>
     <w:p>
-      <w:pPr>
-        <w:jc w:val="left"/>
-      </w:pPr>
       <w:r>
         <w:rPr>
           <w:rFonts w:ascii="Times New Roman" w:hAnsi="Times New Roman"/>
@@ -354,7 +406,7 @@
           <w:color w:val="1F498B"/>
           <w:sz w:val="28"/>
         </w:rPr>
-        <w:t xml:space="preserve">[Слайд 6] </w:t>
+        <w:t>[Слайд 6]</w:t>
       </w:r>
       <w:r>
         <w:rPr>
@@ -363,12 +415,12 @@
           <w:color w:val="1F498B"/>
           <w:sz w:val="28"/>
         </w:rPr>
-        <w:t>— 5 системных барьеров коммуникации</w:t>
+        <w:t xml:space="preserve">  5 барьеров, которые блокируют заказы</w:t>
       </w:r>
     </w:p>
     <w:p>
       <w:pPr>
-        <w:spacing w:after="0"/>
+        <w:spacing w:after="80"/>
         <w:ind w:firstLine="709"/>
         <w:jc w:val="both"/>
       </w:pPr>
@@ -377,12 +429,12 @@
           <w:rFonts w:ascii="Times New Roman" w:hAnsi="Times New Roman"/>
           <w:sz w:val="28"/>
         </w:rPr>
-        <w:t>На основе анализа по модели AIDA и экспертного опроса выявлены пять системных барьеров, которые блокируют устойчивый поток заказов. Барьер видимости: только 38% целевой аудитории знают о компании, в поисковых системах сайт не отображается по профильным запросам. Барьер доказательной базы: на сайте отсутствуют структурированный референс-лист, кейсы внедрений и отзывы заказчиков — а B2B без proof points не продаёт. Барьер конвертации: на сайте нет формы заявки на ТКП, кнопки обратного звонка, CRM-системы — потенциальный клиент уходит без контакта. Барьер аналитики: без KPI-метрик невозможно диагностировать узкие места, управленческие решения принимаются на основе интуиции. Барьер масштабирования: вся воронка продаж замкнута на первом лице — при его отсутствии поток заказов обнуляется.</w:t>
+        <w:t>Мы выявили пять конкретных барьеров.</w:t>
       </w:r>
     </w:p>
     <w:p>
       <w:pPr>
-        <w:spacing w:after="0"/>
+        <w:spacing w:after="80"/>
         <w:ind w:firstLine="709"/>
         <w:jc w:val="both"/>
       </w:pPr>
@@ -391,14 +443,81 @@
           <w:rFonts w:ascii="Times New Roman" w:hAnsi="Times New Roman"/>
           <w:sz w:val="28"/>
         </w:rPr>
-        <w:t>Эти пять барьеров образуют замкнутый контур, размыкание которого требует комплексного управленческого решения.</w:t>
+        <w:t>Барьер 1 — видимость. Только 38% нужной аудитории знают о компании. В поиске сайт не появляется.</w:t>
+      </w:r>
+    </w:p>
+    <w:p>
+      <w:pPr>
+        <w:spacing w:after="80"/>
+        <w:ind w:firstLine="709"/>
+        <w:jc w:val="both"/>
+      </w:pPr>
+      <w:r>
+        <w:rPr>
+          <w:rFonts w:ascii="Times New Roman" w:hAnsi="Times New Roman"/>
+          <w:sz w:val="28"/>
+        </w:rPr>
+        <w:t>Барьер 2 — доказательства. На сайте нет кейсов, нет отзывов клиентов. А в B2B без доказательств не покупают.</w:t>
+      </w:r>
+    </w:p>
+    <w:p>
+      <w:pPr>
+        <w:spacing w:after="80"/>
+        <w:ind w:firstLine="709"/>
+        <w:jc w:val="both"/>
+      </w:pPr>
+      <w:r>
+        <w:rPr>
+          <w:rFonts w:ascii="Times New Roman" w:hAnsi="Times New Roman"/>
+          <w:sz w:val="28"/>
+        </w:rPr>
+        <w:t>Барьер 3 — конвертация. Нет кнопки заявки, нет обратного звонка, нет CRM. Человек зашёл на сайт — и ушёл.</w:t>
+      </w:r>
+    </w:p>
+    <w:p>
+      <w:pPr>
+        <w:spacing w:after="80"/>
+        <w:ind w:firstLine="709"/>
+        <w:jc w:val="both"/>
+      </w:pPr>
+      <w:r>
+        <w:rPr>
+          <w:rFonts w:ascii="Times New Roman" w:hAnsi="Times New Roman"/>
+          <w:sz w:val="28"/>
+        </w:rPr>
+        <w:t>Барьер 4 — аналитика. Никаких метрик нет. Непонятно, что работает, а что нет.</w:t>
+      </w:r>
+    </w:p>
+    <w:p>
+      <w:pPr>
+        <w:spacing w:after="80"/>
+        <w:ind w:firstLine="709"/>
+        <w:jc w:val="both"/>
+      </w:pPr>
+      <w:r>
+        <w:rPr>
+          <w:rFonts w:ascii="Times New Roman" w:hAnsi="Times New Roman"/>
+          <w:sz w:val="28"/>
+        </w:rPr>
+        <w:t>Барьер 5 — масштабирование. Все продажи держатся на одном человеке. Нет воронки — нет системы.</w:t>
+      </w:r>
+    </w:p>
+    <w:p>
+      <w:pPr>
+        <w:spacing w:after="80"/>
+        <w:ind w:firstLine="709"/>
+        <w:jc w:val="both"/>
+      </w:pPr>
+      <w:r>
+        <w:rPr>
+          <w:rFonts w:ascii="Times New Roman" w:hAnsi="Times New Roman"/>
+          <w:sz w:val="28"/>
+        </w:rPr>
+        <w:t>Пока все пять барьеров не убраны — ситуация не изменится.</w:t>
       </w:r>
     </w:p>
     <w:p/>
     <w:p>
-      <w:pPr>
-        <w:jc w:val="left"/>
-      </w:pPr>
       <w:r>
         <w:rPr>
           <w:rFonts w:ascii="Times New Roman" w:hAnsi="Times New Roman"/>
@@ -406,7 +525,7 @@
           <w:color w:val="1F498B"/>
           <w:sz w:val="28"/>
         </w:rPr>
-        <w:t xml:space="preserve">[Слайд 7] </w:t>
+        <w:t>[Слайд 7]</w:t>
       </w:r>
       <w:r>
         <w:rPr>
@@ -415,12 +534,12 @@
           <w:color w:val="1F498B"/>
           <w:sz w:val="28"/>
         </w:rPr>
-        <w:t>— 7 направлений программы совершенствования</w:t>
+        <w:t xml:space="preserve">  7 направлений программы улучшения</w:t>
       </w:r>
     </w:p>
     <w:p>
       <w:pPr>
-        <w:spacing w:after="0"/>
+        <w:spacing w:after="80"/>
         <w:ind w:firstLine="709"/>
         <w:jc w:val="both"/>
       </w:pPr>
@@ -429,14 +548,123 @@
           <w:rFonts w:ascii="Times New Roman" w:hAnsi="Times New Roman"/>
           <w:sz w:val="28"/>
         </w:rPr>
-        <w:t>В третьей главе разработана комплексная программа совершенствования, включающая семь взаимосвязанных направлений, каждое из которых адресует один или несколько выявленных барьеров коммуникации. Первое — формализация маркетинговой стратегии и медиаплана с целями, KPI и бюджетом (I квартал). Второе — модернизация корпоративного сайта по принципам B2B-юзабилити: форма ТКП, мобильная версия, конверсионные элементы (I–II кварталы). Третье — SEO-оптимизация и запуск контекстной рекламы в Яндекс.Директе для привлечения органического и платного трафика (II квартал). Четвёртое — развитие контент-маркетинга через Telegram-канал с публикацией 1–2 экспертных материалов в неделю (II–IV кварталы). Пятое — участие в 1–2 ключевых отраслевых выставках и конференциях в год (III квартал). Шестое — внедрение CRM-системы «Битрикс24» для учёта, квалификации и аналитики лидов (II квартал). Седьмое — формирование структурированного референс-листа реализованных проектов с числовыми показателями эффекта для заказчиков (II–III кварталы).</w:t>
+        <w:t>В третьей главе мы разработали программу из семи шагов.</w:t>
+      </w:r>
+    </w:p>
+    <w:p>
+      <w:pPr>
+        <w:spacing w:after="80"/>
+        <w:ind w:firstLine="709"/>
+        <w:jc w:val="both"/>
+      </w:pPr>
+      <w:r>
+        <w:rPr>
+          <w:rFonts w:ascii="Times New Roman" w:hAnsi="Times New Roman"/>
+          <w:sz w:val="28"/>
+        </w:rPr>
+        <w:t>1. Написать маркетинговую стратегию — цели, KPI, бюджет.</w:t>
+      </w:r>
+    </w:p>
+    <w:p>
+      <w:pPr>
+        <w:spacing w:after="80"/>
+        <w:ind w:firstLine="709"/>
+        <w:jc w:val="both"/>
+      </w:pPr>
+      <w:r>
+        <w:rPr>
+          <w:rFonts w:ascii="Times New Roman" w:hAnsi="Times New Roman"/>
+          <w:sz w:val="28"/>
+        </w:rPr>
+        <w:t>2. Переделать сайт под B2B: добавить форму заявки, мобильную версию, отраслевые страницы.</w:t>
+      </w:r>
+    </w:p>
+    <w:p>
+      <w:pPr>
+        <w:spacing w:after="80"/>
+        <w:ind w:firstLine="709"/>
+        <w:jc w:val="both"/>
+      </w:pPr>
+      <w:r>
+        <w:rPr>
+          <w:rFonts w:ascii="Times New Roman" w:hAnsi="Times New Roman"/>
+          <w:sz w:val="28"/>
+        </w:rPr>
+        <w:t>3. Запустить SEO и рекламу в Яндекс.Директе — чтобы компанию находили в поиске.</w:t>
+      </w:r>
+    </w:p>
+    <w:p>
+      <w:pPr>
+        <w:spacing w:after="80"/>
+        <w:ind w:firstLine="709"/>
+        <w:jc w:val="both"/>
+      </w:pPr>
+      <w:r>
+        <w:rPr>
+          <w:rFonts w:ascii="Times New Roman" w:hAnsi="Times New Roman"/>
+          <w:sz w:val="28"/>
+        </w:rPr>
+        <w:t>4. Вести Telegram-канал — 1–2 экспертных поста в неделю.</w:t>
+      </w:r>
+    </w:p>
+    <w:p>
+      <w:pPr>
+        <w:spacing w:after="80"/>
+        <w:ind w:firstLine="709"/>
+        <w:jc w:val="both"/>
+      </w:pPr>
+      <w:r>
+        <w:rPr>
+          <w:rFonts w:ascii="Times New Roman" w:hAnsi="Times New Roman"/>
+          <w:sz w:val="28"/>
+        </w:rPr>
+        <w:t>5. Участвовать в 1–2 отраслевых выставках в год.</w:t>
+      </w:r>
+    </w:p>
+    <w:p>
+      <w:pPr>
+        <w:spacing w:after="80"/>
+        <w:ind w:firstLine="709"/>
+        <w:jc w:val="both"/>
+      </w:pPr>
+      <w:r>
+        <w:rPr>
+          <w:rFonts w:ascii="Times New Roman" w:hAnsi="Times New Roman"/>
+          <w:sz w:val="28"/>
+        </w:rPr>
+        <w:t>6. Внедрить CRM «Битрикс24» — считать лиды, вести аналитику.</w:t>
+      </w:r>
+    </w:p>
+    <w:p>
+      <w:pPr>
+        <w:spacing w:after="80"/>
+        <w:ind w:firstLine="709"/>
+        <w:jc w:val="both"/>
+      </w:pPr>
+      <w:r>
+        <w:rPr>
+          <w:rFonts w:ascii="Times New Roman" w:hAnsi="Times New Roman"/>
+          <w:sz w:val="28"/>
+        </w:rPr>
+        <w:t>7. Собрать референс-лист — реальные проекты с цифрами для заказчиков.</w:t>
+      </w:r>
+    </w:p>
+    <w:p>
+      <w:pPr>
+        <w:spacing w:after="80"/>
+        <w:ind w:firstLine="709"/>
+        <w:jc w:val="both"/>
+      </w:pPr>
+      <w:r>
+        <w:rPr>
+          <w:rFonts w:ascii="Times New Roman" w:hAnsi="Times New Roman"/>
+          <w:sz w:val="28"/>
+        </w:rPr>
+        <w:t>Каждый шаг убирает один или несколько из пяти барьеров.</w:t>
       </w:r>
     </w:p>
     <w:p/>
     <w:p>
-      <w:pPr>
-        <w:jc w:val="left"/>
-      </w:pPr>
       <w:r>
         <w:rPr>
           <w:rFonts w:ascii="Times New Roman" w:hAnsi="Times New Roman"/>
@@ -444,7 +672,7 @@
           <w:color w:val="1F498B"/>
           <w:sz w:val="28"/>
         </w:rPr>
-        <w:t xml:space="preserve">[Слайд 8] </w:t>
+        <w:t>[Слайд 8]</w:t>
       </w:r>
       <w:r>
         <w:rPr>
@@ -453,12 +681,12 @@
           <w:color w:val="1F498B"/>
           <w:sz w:val="28"/>
         </w:rPr>
-        <w:t>— Медиаплан: 12 мероприятий, суммарный бюджет — 2 000 тыс. руб.</w:t>
+        <w:t xml:space="preserve">  Медиаплан на 2026 год</w:t>
       </w:r>
     </w:p>
     <w:p>
       <w:pPr>
-        <w:spacing w:after="0"/>
+        <w:spacing w:after="80"/>
         <w:ind w:firstLine="709"/>
         <w:jc w:val="both"/>
       </w:pPr>
@@ -467,14 +695,25 @@
           <w:rFonts w:ascii="Times New Roman" w:hAnsi="Times New Roman"/>
           <w:sz w:val="28"/>
         </w:rPr>
-        <w:t>На основе семи направлений сформирован медиаплан на 2026 год, включающий двенадцать конкретных мероприятий с распределением по кварталам, ответственным лицам и ожидаемым результатам. Суммарный бюджет составляет 2 000 тысяч рублей. Наиболее ресурсоёмкие позиции — контекстная реклама в Яндекс.Директе (500 тысяч рублей), SEO-оптимизация сайта (300 тысяч рублей), внедрение CRM «Битрикс24» (350 тысяч рублей) и участие в отраслевой выставке (200 тысяч рублей). Ряд мероприятий — маркетинговая стратегия, подключение Яндекс.Метрики, референс-лист — реализуются без прямых денежных затрат.</w:t>
+        <w:t>На основе этих семи направлений составлен конкретный медиаплан: 12 мероприятий, расписанных по кварталам. Общий бюджет — 2 000 тысяч рублей.</w:t>
+      </w:r>
+    </w:p>
+    <w:p>
+      <w:pPr>
+        <w:spacing w:after="80"/>
+        <w:ind w:firstLine="709"/>
+        <w:jc w:val="both"/>
+      </w:pPr>
+      <w:r>
+        <w:rPr>
+          <w:rFonts w:ascii="Times New Roman" w:hAnsi="Times New Roman"/>
+          <w:sz w:val="28"/>
+        </w:rPr>
+        <w:t>Крупнейшие статьи расходов: Яндекс.Директ — 500 тысяч, CRM — 350 тысяч, SEO — 300 тысяч, выставка — 200 тысяч, сайт — 250 тысяч. Часть мероприятий — бесплатная: стратегия, подключение Яндекс.Метрики, референс-лист.</w:t>
       </w:r>
     </w:p>
     <w:p/>
     <w:p>
-      <w:pPr>
-        <w:jc w:val="left"/>
-      </w:pPr>
       <w:r>
         <w:rPr>
           <w:rFonts w:ascii="Times New Roman" w:hAnsi="Times New Roman"/>
@@ -482,7 +721,7 @@
           <w:color w:val="1F498B"/>
           <w:sz w:val="28"/>
         </w:rPr>
-        <w:t xml:space="preserve">[Слайд 9] </w:t>
+        <w:t>[Слайд 9]</w:t>
       </w:r>
       <w:r>
         <w:rPr>
@@ -491,12 +730,12 @@
           <w:color w:val="1F498B"/>
           <w:sz w:val="28"/>
         </w:rPr>
-        <w:t>— Экономическое обоснование: ROMI 78,8% — инвестиции окупаемы</w:t>
+        <w:t xml:space="preserve">  Окупаемость: ROMI 78,8%</w:t>
       </w:r>
     </w:p>
     <w:p>
       <w:pPr>
-        <w:spacing w:after="0"/>
+        <w:spacing w:after="80"/>
         <w:ind w:firstLine="709"/>
         <w:jc w:val="both"/>
       </w:pPr>
@@ -505,14 +744,67 @@
           <w:rFonts w:ascii="Times New Roman" w:hAnsi="Times New Roman"/>
           <w:sz w:val="28"/>
         </w:rPr>
-        <w:t>Ожидаемая эффективность медиаплана рассчитана по трём сценариям. В реалистическом сценарии — который принят как базовый — прогнозируется: рост среднемесячного числа входящих обращений в 8 раз (с 3 до 25), заключение 6 договоров в год, выручка по итогам 2026 года — 4 500 тысяч рублей. Рентабельность рекламной деятельности составит 78,8%, накопленный ROMI за два года — порядка плюс 57,5%, срок окупаемости — от 18 до 24 месяцев, что соответствует приемлемому ориентиру для B2B-сегмента сложного инжинирингового оборудования. В оптимистическом сценарии выручка достигает 6 750 тысяч рублей с ROMI 145%. В пессимистическом — 2 250 тысяч рублей при ROMI 12,5%. Анализ чувствительности показал устойчивость медиаплана к умеренным отклонениям ключевых параметров.</w:t>
+        <w:t>Теперь о деньгах. Мы посчитали три сценария.</w:t>
+      </w:r>
+    </w:p>
+    <w:p>
+      <w:pPr>
+        <w:spacing w:after="80"/>
+        <w:ind w:firstLine="709"/>
+        <w:jc w:val="both"/>
+      </w:pPr>
+      <w:r>
+        <w:rPr>
+          <w:rFonts w:ascii="Times New Roman" w:hAnsi="Times New Roman"/>
+          <w:sz w:val="28"/>
+        </w:rPr>
+        <w:t>Реалистичный — базовый. Обращений станет в 8 раз больше: с 3 до 25 в месяц. Будет заключено 6 договоров в год. Выручка в 2026 году — 4 500 тысяч рублей. Рентабельность рекламы — 78,8%. Вложения окупятся за 18–24 месяца.</w:t>
+      </w:r>
+    </w:p>
+    <w:p>
+      <w:pPr>
+        <w:spacing w:after="80"/>
+        <w:ind w:firstLine="709"/>
+        <w:jc w:val="both"/>
+      </w:pPr>
+      <w:r>
+        <w:rPr>
+          <w:rFonts w:ascii="Times New Roman" w:hAnsi="Times New Roman"/>
+          <w:sz w:val="28"/>
+        </w:rPr>
+        <w:t>Оптимистичный: выручка 6 750 тысяч рублей, ROMI — 145%, окупаемость — 12–15 месяцев.</w:t>
+      </w:r>
+    </w:p>
+    <w:p>
+      <w:pPr>
+        <w:spacing w:after="80"/>
+        <w:ind w:firstLine="709"/>
+        <w:jc w:val="both"/>
+      </w:pPr>
+      <w:r>
+        <w:rPr>
+          <w:rFonts w:ascii="Times New Roman" w:hAnsi="Times New Roman"/>
+          <w:sz w:val="28"/>
+        </w:rPr>
+        <w:t>Пессимистичный: выручка 2 250 тысяч рублей, ROMI — 12,5%, окупаемость — больше 30 месяцев.</w:t>
+      </w:r>
+    </w:p>
+    <w:p>
+      <w:pPr>
+        <w:spacing w:after="80"/>
+        <w:ind w:firstLine="709"/>
+        <w:jc w:val="both"/>
+      </w:pPr>
+      <w:r>
+        <w:rPr>
+          <w:rFonts w:ascii="Times New Roman" w:hAnsi="Times New Roman"/>
+          <w:sz w:val="28"/>
+        </w:rPr>
+        <w:t>Даже в худшем варианте инвестиции не сгорают — они просто окупаются дольше.</w:t>
       </w:r>
     </w:p>
     <w:p/>
     <w:p>
-      <w:pPr>
-        <w:jc w:val="left"/>
-      </w:pPr>
       <w:r>
         <w:rPr>
           <w:rFonts w:ascii="Times New Roman" w:hAnsi="Times New Roman"/>
@@ -520,7 +812,7 @@
           <w:color w:val="1F498B"/>
           <w:sz w:val="28"/>
         </w:rPr>
-        <w:t xml:space="preserve">[Слайд 10–11] </w:t>
+        <w:t>[Слайд 10–11]</w:t>
       </w:r>
       <w:r>
         <w:rPr>
@@ -529,12 +821,12 @@
           <w:color w:val="1F498B"/>
           <w:sz w:val="28"/>
         </w:rPr>
-        <w:t>— Выводы и научная значимость</w:t>
+        <w:t xml:space="preserve">  Выводы</w:t>
       </w:r>
     </w:p>
     <w:p>
       <w:pPr>
-        <w:spacing w:after="0"/>
+        <w:spacing w:after="80"/>
         <w:ind w:firstLine="709"/>
         <w:jc w:val="both"/>
       </w:pPr>
@@ -543,12 +835,12 @@
           <w:rFonts w:ascii="Times New Roman" w:hAnsi="Times New Roman"/>
           <w:sz w:val="28"/>
         </w:rPr>
-        <w:t>В заключение хотел бы подвести ключевые итоги исследования. В работе доказано, что ограниченная рекламно-информационная работа является главной причиной сбытового кризиса предприятия. Разработана комплексная программа совершенствования из 7 направлений и 12 мероприятий с бюджетом 2 000 тысяч рублей и расчётом ROI по трём сценариям. Предложена и апробирована авторская методика СИЭР — Сводный Индекс Эффективности Рекламно-информационной работы, которая применима не только для ООО «ФАСТ ИНЖИНИРИНГ», но и для других инжиниринговых микропредприятий B2B-сегмента.</w:t>
+        <w:t>Подведу итог.</w:t>
       </w:r>
     </w:p>
     <w:p>
       <w:pPr>
-        <w:spacing w:after="0"/>
+        <w:spacing w:after="80"/>
         <w:ind w:firstLine="709"/>
         <w:jc w:val="both"/>
       </w:pPr>
@@ -557,7 +849,35 @@
           <w:rFonts w:ascii="Times New Roman" w:hAnsi="Times New Roman"/>
           <w:sz w:val="28"/>
         </w:rPr>
-        <w:t>Практическая значимость работы состоит в том, что разработанные медиаплан, алгоритм аудита сайта и чек-лист барьеров коммуникации полностью готовы к применению в 2026 году. Результаты исследования наглядно показывают: внедрение комплексной рекламной программы обеспечит ООО «ФАСТ ИНЖИНИРИНГ» стабильный поток заявок и рост выручки даже в рамках ограниченного бюджета.</w:t>
+        <w:t>Первое — мы доказали: главная причина сбытового кризиса — отсутствие системной рекламно-информационной работы. Не производство, не продукт — а реклама.</w:t>
+      </w:r>
+    </w:p>
+    <w:p>
+      <w:pPr>
+        <w:spacing w:after="80"/>
+        <w:ind w:firstLine="709"/>
+        <w:jc w:val="both"/>
+      </w:pPr>
+      <w:r>
+        <w:rPr>
+          <w:rFonts w:ascii="Times New Roman" w:hAnsi="Times New Roman"/>
+          <w:sz w:val="28"/>
+        </w:rPr>
+        <w:t>Второе — мы разработали конкретную программу: 7 направлений, 12 мероприятий, бюджет 2 миллиона рублей. Всё готово к внедрению в 2026 году.</w:t>
+      </w:r>
+    </w:p>
+    <w:p>
+      <w:pPr>
+        <w:spacing w:after="80"/>
+        <w:ind w:firstLine="709"/>
+        <w:jc w:val="both"/>
+      </w:pPr>
+      <w:r>
+        <w:rPr>
+          <w:rFonts w:ascii="Times New Roman" w:hAnsi="Times New Roman"/>
+          <w:sz w:val="28"/>
+        </w:rPr>
+        <w:t>Третье — предложена авторская методика СИЭР — Сводный Индекс Эффективности Рекламно-информационной работы. Её можно применять и в других инжиниринговых компаниях.</w:t>
       </w:r>
     </w:p>
     <w:p/>
@@ -571,7 +891,7 @@
           <w:b/>
           <w:sz w:val="28"/>
         </w:rPr>
-        <w:t>Доклад завершён. Готов ответить на вопросы членов комиссии.</w:t>
+        <w:t>Доклад завершён. Готов ответить на ваши вопросы.</w:t>
       </w:r>
     </w:p>
     <w:p>
@@ -584,7 +904,7 @@
           <w:i/>
           <w:sz w:val="24"/>
         </w:rPr>
-        <w:t>Время доклада: ~7 минут (≈ 3 страницы)</w:t>
+        <w:t>Время доклада: ~7 минут</w:t>
       </w:r>
     </w:p>
     <w:sectPr>

</xml_diff>

<commit_message>
Balance speech complexity: clear sentences, natural flow, easy to read aloud
Co-authored-by: emikateam-coder <emikateam-coder@users.noreply.github.com>
</commit_message>
<xml_diff>
--- a/Речь_к_защите_Остапенко.docx
+++ b/Речь_к_защите_Остапенко.docx
@@ -25,7 +25,7 @@
           <w:b/>
           <w:sz w:val="28"/>
         </w:rPr>
-        <w:t>«Организация рекламно-информационной работы</w:t>
+        <w:t>«Организация рекламно-информационной работы коммерческой организации</w:t>
       </w:r>
     </w:p>
     <w:p>
@@ -38,8 +38,501 @@
           <w:b/>
           <w:sz w:val="28"/>
         </w:rPr>
-        <w:t>коммерческой организации и оценка её эффективности</w:t>
+        <w:t>и оценка её эффективности (на примере ООО "ФАСТ ИНЖИНИРИНГ")»</w:t>
       </w:r>
+    </w:p>
+    <w:p>
+      <w:pPr>
+        <w:spacing w:after="0"/>
+      </w:pPr>
+    </w:p>
+    <w:p>
+      <w:r>
+        <w:rPr>
+          <w:rFonts w:ascii="Times New Roman" w:hAnsi="Times New Roman"/>
+          <w:b/>
+          <w:color w:val="1F498B"/>
+          <w:sz w:val="28"/>
+        </w:rPr>
+        <w:t xml:space="preserve">[Слайд 1]  </w:t>
+      </w:r>
+      <w:r>
+        <w:rPr>
+          <w:rFonts w:ascii="Times New Roman" w:hAnsi="Times New Roman"/>
+          <w:b/>
+          <w:color w:val="1F498B"/>
+          <w:sz w:val="28"/>
+        </w:rPr>
+        <w:t>Титульный слайд</w:t>
+      </w:r>
+    </w:p>
+    <w:p>
+      <w:pPr>
+        <w:spacing w:after="120"/>
+        <w:ind w:firstLine="709"/>
+        <w:jc w:val="both"/>
+      </w:pPr>
+      <w:r>
+        <w:rPr>
+          <w:rFonts w:ascii="Times New Roman" w:hAnsi="Times New Roman"/>
+          <w:sz w:val="28"/>
+        </w:rPr>
+        <w:t>Уважаемый Председатель, уважаемые члены Государственной Аттестационной Комиссии! Вашему вниманию представляется дипломная работа на тему «Организация рекламно-информационной работы коммерческой организации и оценка её эффективности» — на примере ООО «ФАСТ ИНЖИНИРИНГ». Научный руководитель — кандидат экономических наук, доцент Саенко Мария Юрьевна.</w:t>
+      </w:r>
+    </w:p>
+    <w:p>
+      <w:pPr>
+        <w:spacing w:after="0"/>
+      </w:pPr>
+    </w:p>
+    <w:p>
+      <w:r>
+        <w:rPr>
+          <w:rFonts w:ascii="Times New Roman" w:hAnsi="Times New Roman"/>
+          <w:b/>
+          <w:color w:val="1F498B"/>
+          <w:sz w:val="28"/>
+        </w:rPr>
+        <w:t xml:space="preserve">[Слайд 2]  </w:t>
+      </w:r>
+      <w:r>
+        <w:rPr>
+          <w:rFonts w:ascii="Times New Roman" w:hAnsi="Times New Roman"/>
+          <w:b/>
+          <w:color w:val="1F498B"/>
+          <w:sz w:val="28"/>
+        </w:rPr>
+        <w:t>Актуальность, цель и задачи</w:t>
+      </w:r>
+    </w:p>
+    <w:p>
+      <w:pPr>
+        <w:spacing w:after="120"/>
+        <w:ind w:firstLine="709"/>
+        <w:jc w:val="both"/>
+      </w:pPr>
+      <w:r>
+        <w:rPr>
+          <w:rFonts w:ascii="Times New Roman" w:hAnsi="Times New Roman"/>
+          <w:sz w:val="28"/>
+        </w:rPr>
+        <w:t>Актуальность темы определяется тремя группами факторов. Первый — экономический: государственный курс на импортозамещение резко повысил роль отечественных инжиниринговых компаний, однако технологического превосходства недостаточно — без грамотной рекламно-информационной работы промышленный заказчик просто не узнает о продукте. Второй — регуляторный: поправки 2022–2023 годов к Федеральному закону №38-ФЗ «О рекламе» ввели обязательную маркировку интернет-рекламы и Единый реестр, что сделало правильную организацию рекламной деятельности требованием закона. Третий — методический: в научной литературе нет устоявшегося инструментария оценки эффективности рекламы для небольших B2B-компаний с длительным циклом сделки.</w:t>
+      </w:r>
+    </w:p>
+    <w:p>
+      <w:pPr>
+        <w:spacing w:after="120"/>
+        <w:ind w:firstLine="709"/>
+        <w:jc w:val="both"/>
+      </w:pPr>
+      <w:r>
+        <w:rPr>
+          <w:rFonts w:ascii="Times New Roman" w:hAnsi="Times New Roman"/>
+          <w:sz w:val="28"/>
+        </w:rPr>
+        <w:t>Объект исследования — рекламно-информационная деятельность ООО «ФАСТ ИНЖИНИРИНГ». Цель — разработать обоснованные предложения по её совершенствованию и оценить экономическую отдачу. Для достижения цели решены восемь задач, которые охватывают теоретическую базу, анализ текущей ситуации, разработку программы улучшений и её финансовое обоснование.</w:t>
+      </w:r>
+    </w:p>
+    <w:p>
+      <w:pPr>
+        <w:spacing w:after="0"/>
+      </w:pPr>
+    </w:p>
+    <w:p>
+      <w:r>
+        <w:rPr>
+          <w:rFonts w:ascii="Times New Roman" w:hAnsi="Times New Roman"/>
+          <w:b/>
+          <w:color w:val="1F498B"/>
+          <w:sz w:val="28"/>
+        </w:rPr>
+        <w:t xml:space="preserve">[Слайд 3]  </w:t>
+      </w:r>
+      <w:r>
+        <w:rPr>
+          <w:rFonts w:ascii="Times New Roman" w:hAnsi="Times New Roman"/>
+          <w:b/>
+          <w:color w:val="1F498B"/>
+          <w:sz w:val="28"/>
+        </w:rPr>
+        <w:t>Характеристика объекта исследования</w:t>
+      </w:r>
+    </w:p>
+    <w:p>
+      <w:pPr>
+        <w:spacing w:after="120"/>
+        <w:ind w:firstLine="709"/>
+        <w:jc w:val="both"/>
+      </w:pPr>
+      <w:r>
+        <w:rPr>
+          <w:rFonts w:ascii="Times New Roman" w:hAnsi="Times New Roman"/>
+          <w:sz w:val="28"/>
+        </w:rPr>
+        <w:t>ООО «ФАСТ ИНЖИНИРИНГ» — московское микропредприятие численностью до десяти человек, основанное в 1991 году. Компания разрабатывает и поставляет инновационное промышленное оборудование: теплообменные и массообменные аппараты, каталитические реакторы, беспламенные горелки и водородные аккумуляторы. Все разработки защищены патентами Российской Федерации.</w:t>
+      </w:r>
+    </w:p>
+    <w:p>
+      <w:pPr>
+        <w:spacing w:after="120"/>
+        <w:ind w:firstLine="709"/>
+        <w:jc w:val="both"/>
+      </w:pPr>
+      <w:r>
+        <w:rPr>
+          <w:rFonts w:ascii="Times New Roman" w:hAnsi="Times New Roman"/>
+          <w:sz w:val="28"/>
+        </w:rPr>
+        <w:t>С точки зрения статусов и достижений: в январе 2026 года компания получила статус Малой технологической компании Министерства экономического развития, является лауреатом премии «Новатор Москвы» и финалистом конкурса GREENTECH фонда «Сколково». Среди реальных заказчиков — НОВАТЭК, ЕВРОХИМ, ТАНЕКО, МОСЭНЕРГО. То есть перед нами технологически сильная компания с подтверждёнными компетенциями. Тем более показательна проблема, которую зафиксировал анализ.</w:t>
+      </w:r>
+    </w:p>
+    <w:p>
+      <w:pPr>
+        <w:spacing w:after="0"/>
+      </w:pPr>
+    </w:p>
+    <w:p>
+      <w:r>
+        <w:rPr>
+          <w:rFonts w:ascii="Times New Roman" w:hAnsi="Times New Roman"/>
+          <w:b/>
+          <w:color w:val="1F498B"/>
+          <w:sz w:val="28"/>
+        </w:rPr>
+        <w:t xml:space="preserve">[Слайд 4]  </w:t>
+      </w:r>
+      <w:r>
+        <w:rPr>
+          <w:rFonts w:ascii="Times New Roman" w:hAnsi="Times New Roman"/>
+          <w:b/>
+          <w:color w:val="1F498B"/>
+          <w:sz w:val="28"/>
+        </w:rPr>
+        <w:t>Ключевая проблема: выручка упала на 80,4%</w:t>
+      </w:r>
+    </w:p>
+    <w:p>
+      <w:pPr>
+        <w:spacing w:after="120"/>
+        <w:ind w:firstLine="709"/>
+        <w:jc w:val="both"/>
+      </w:pPr>
+      <w:r>
+        <w:rPr>
+          <w:rFonts w:ascii="Times New Roman" w:hAnsi="Times New Roman"/>
+          <w:sz w:val="28"/>
+        </w:rPr>
+        <w:t>Финансовый анализ за 2023–2025 годы выявил острый сбытовой кризис. Выручка компании сократилась с 5 605 тысяч рублей в 2023 году до 375 тысяч в 2024-м — это падение в пятнадцать раз. Прибыль обнулилась. В 2025 году наметилось восстановление до 1 100 тысяч рублей, однако до уровня 2023 года ещё далеко.</w:t>
+      </w:r>
+    </w:p>
+    <w:p>
+      <w:pPr>
+        <w:spacing w:after="120"/>
+        <w:ind w:firstLine="709"/>
+        <w:jc w:val="both"/>
+      </w:pPr>
+      <w:r>
+        <w:rPr>
+          <w:rFonts w:ascii="Times New Roman" w:hAnsi="Times New Roman"/>
+          <w:sz w:val="28"/>
+        </w:rPr>
+        <w:t>Принципиальный вывод: причина кризиса — не производственная, а сбытовая. Производство работает, кадры на месте, патенты действуют. Но маркетинговой функции в компании нет, стратегия продвижения не сформирована, поток входящих заказов не выстроен. Компания использует лишь два из шести возможных маркетинговых инструментов, узнаваемость в отрасли — около 38%, а среднее число входящих обращений — порядка трёх в месяц. Это и есть точка приложения усилий.</w:t>
+      </w:r>
+    </w:p>
+    <w:p>
+      <w:pPr>
+        <w:spacing w:after="0"/>
+      </w:pPr>
+    </w:p>
+    <w:p>
+      <w:r>
+        <w:rPr>
+          <w:rFonts w:ascii="Times New Roman" w:hAnsi="Times New Roman"/>
+          <w:b/>
+          <w:color w:val="1F498B"/>
+          <w:sz w:val="28"/>
+        </w:rPr>
+        <w:t xml:space="preserve">[Слайд 5]  </w:t>
+      </w:r>
+      <w:r>
+        <w:rPr>
+          <w:rFonts w:ascii="Times New Roman" w:hAnsi="Times New Roman"/>
+          <w:b/>
+          <w:color w:val="1F498B"/>
+          <w:sz w:val="28"/>
+        </w:rPr>
+        <w:t>SWOT-анализ рекламно-информационной работы</w:t>
+      </w:r>
+    </w:p>
+    <w:p>
+      <w:pPr>
+        <w:spacing w:after="120"/>
+        <w:ind w:firstLine="709"/>
+        <w:jc w:val="both"/>
+      </w:pPr>
+      <w:r>
+        <w:rPr>
+          <w:rFonts w:ascii="Times New Roman" w:hAnsi="Times New Roman"/>
+          <w:sz w:val="28"/>
+        </w:rPr>
+        <w:t>По результатам второй главы был проведён SWOT-анализ системы рекламно-информационной работы предприятия. К сильным сторонам относятся: уникальная патентованная продукция, высокая техническая экспертиза, статусы «Сколково» и «Новатор Москвы», реальные крупные промышленные заказчики. Слабые стороны — отсутствие маркетолога в штате, сайт устаревшей архитектуры, продвижение строится исключительно на личных контактах руководителя, не сформирован референс-лист реализованных проектов.</w:t>
+      </w:r>
+    </w:p>
+    <w:p>
+      <w:pPr>
+        <w:spacing w:after="120"/>
+        <w:ind w:firstLine="709"/>
+        <w:jc w:val="both"/>
+      </w:pPr>
+      <w:r>
+        <w:rPr>
+          <w:rFonts w:ascii="Times New Roman" w:hAnsi="Times New Roman"/>
+          <w:sz w:val="28"/>
+        </w:rPr>
+        <w:t>Среди возможностей — рост спроса за счёт импортозамещения, доступность цифровых каналов: SEO, Яндекс.Директ, Telegram. Угрозы — длинный цикл B2B-сделки, регуляторные требования к рекламе, растущая конкуренция и критическая зависимость всего потока продаж от одного человека.</w:t>
+      </w:r>
+    </w:p>
+    <w:p>
+      <w:pPr>
+        <w:spacing w:after="0"/>
+      </w:pPr>
+    </w:p>
+    <w:p>
+      <w:r>
+        <w:rPr>
+          <w:rFonts w:ascii="Times New Roman" w:hAnsi="Times New Roman"/>
+          <w:b/>
+          <w:color w:val="1F498B"/>
+          <w:sz w:val="28"/>
+        </w:rPr>
+        <w:t xml:space="preserve">[Слайд 6]  </w:t>
+      </w:r>
+      <w:r>
+        <w:rPr>
+          <w:rFonts w:ascii="Times New Roman" w:hAnsi="Times New Roman"/>
+          <w:b/>
+          <w:color w:val="1F498B"/>
+          <w:sz w:val="28"/>
+        </w:rPr>
+        <w:t>Пять системных барьеров коммуникации</w:t>
+      </w:r>
+    </w:p>
+    <w:p>
+      <w:pPr>
+        <w:spacing w:after="120"/>
+        <w:ind w:firstLine="709"/>
+        <w:jc w:val="both"/>
+      </w:pPr>
+      <w:r>
+        <w:rPr>
+          <w:rFonts w:ascii="Times New Roman" w:hAnsi="Times New Roman"/>
+          <w:sz w:val="28"/>
+        </w:rPr>
+        <w:t>На основе анализа по модели AIDA и экспертного опроса выявлены пять барьеров, которые блокируют устойчивый поток заказов. Барьер видимости: лишь 38% целевой аудитории знают о компании, в поисковых системах сайт по профильным запросам не отображается. Барьер доказательной базы: на сайте нет ни кейсов, ни отзывов клиентов — а в промышленном B2B без подтверждённого опыта покупку не совершают. Барьер конвертации: отсутствует форма заявки на технико-коммерческое предложение, нет кнопки обратного звонка, не внедрена CRM — потенциальный клиент уходит без контакта. Барьер аналитики: без метрик невозможно понять, что работает, управленческие решения принимаются на интуиции. Барьер масштабирования: вся воронка продаж замкнута на первом лице компании — это делает бизнес нестабильным.</w:t>
+      </w:r>
+    </w:p>
+    <w:p>
+      <w:pPr>
+        <w:spacing w:after="120"/>
+        <w:ind w:firstLine="709"/>
+        <w:jc w:val="both"/>
+      </w:pPr>
+      <w:r>
+        <w:rPr>
+          <w:rFonts w:ascii="Times New Roman" w:hAnsi="Times New Roman"/>
+          <w:sz w:val="28"/>
+        </w:rPr>
+        <w:t>Все пять барьеров взаимосвязаны и образуют замкнутый контур, для разрыва которого нужна комплексная программа.</w:t>
+      </w:r>
+    </w:p>
+    <w:p>
+      <w:pPr>
+        <w:spacing w:after="0"/>
+      </w:pPr>
+    </w:p>
+    <w:p>
+      <w:r>
+        <w:rPr>
+          <w:rFonts w:ascii="Times New Roman" w:hAnsi="Times New Roman"/>
+          <w:b/>
+          <w:color w:val="1F498B"/>
+          <w:sz w:val="28"/>
+        </w:rPr>
+        <w:t xml:space="preserve">[Слайд 7]  </w:t>
+      </w:r>
+      <w:r>
+        <w:rPr>
+          <w:rFonts w:ascii="Times New Roman" w:hAnsi="Times New Roman"/>
+          <w:b/>
+          <w:color w:val="1F498B"/>
+          <w:sz w:val="28"/>
+        </w:rPr>
+        <w:t>Семь направлений программы совершенствования</w:t>
+      </w:r>
+    </w:p>
+    <w:p>
+      <w:pPr>
+        <w:spacing w:after="120"/>
+        <w:ind w:firstLine="709"/>
+        <w:jc w:val="both"/>
+      </w:pPr>
+      <w:r>
+        <w:rPr>
+          <w:rFonts w:ascii="Times New Roman" w:hAnsi="Times New Roman"/>
+          <w:sz w:val="28"/>
+        </w:rPr>
+        <w:t>В третьей главе разработана программа из семи взаимосвязанных направлений, каждое из которых закрывает один или несколько выявленных барьеров. Первое — формализация маркетинговой стратегии с целями, KPI и бюджетом. Второе — модернизация корпоративного сайта по принципам B2B-юзабилити: форма заявки на ТКП, мобильная версия, отраслевые посадочные страницы. Третье — запуск SEO-оптимизации и контекстной рекламы в Яндекс.Директе. Четвёртое — ведение Telegram-канала с публикацией 1–2 экспертных материалов в неделю. Пятое — участие в 1–2 ключевых отраслевых выставках в год. Шестое — внедрение CRM-системы «Битрикс24» для учёта и анализа лидов. Седьмое — формирование структурированного референс-листа с числовыми результатами для каждого реализованного проекта.</w:t>
+      </w:r>
+    </w:p>
+    <w:p>
+      <w:pPr>
+        <w:spacing w:after="0"/>
+      </w:pPr>
+    </w:p>
+    <w:p>
+      <w:r>
+        <w:rPr>
+          <w:rFonts w:ascii="Times New Roman" w:hAnsi="Times New Roman"/>
+          <w:b/>
+          <w:color w:val="1F498B"/>
+          <w:sz w:val="28"/>
+        </w:rPr>
+        <w:t xml:space="preserve">[Слайд 8]  </w:t>
+      </w:r>
+      <w:r>
+        <w:rPr>
+          <w:rFonts w:ascii="Times New Roman" w:hAnsi="Times New Roman"/>
+          <w:b/>
+          <w:color w:val="1F498B"/>
+          <w:sz w:val="28"/>
+        </w:rPr>
+        <w:t>Медиаплан на 2026 год</w:t>
+      </w:r>
+    </w:p>
+    <w:p>
+      <w:pPr>
+        <w:spacing w:after="120"/>
+        <w:ind w:firstLine="709"/>
+        <w:jc w:val="both"/>
+      </w:pPr>
+      <w:r>
+        <w:rPr>
+          <w:rFonts w:ascii="Times New Roman" w:hAnsi="Times New Roman"/>
+          <w:sz w:val="28"/>
+        </w:rPr>
+        <w:t>На основе семи направлений составлен медиаплан на 2026 год: двенадцать конкретных мероприятий с распределением по кварталам, ответственными и ожидаемыми результатами. Суммарный бюджет — 2 000 тысяч рублей. Основные статьи затрат: Яндекс.Директ — 500 тысяч, CRM — 350 тысяч, SEO — 300 тысяч, выставка — 200 тысяч, модернизация сайта — 250 тысяч. Часть мероприятий — разработка стратегии, подключение веб-аналитики, создание референс-листа — реализуется без прямых расходов.</w:t>
+      </w:r>
+    </w:p>
+    <w:p>
+      <w:pPr>
+        <w:spacing w:after="0"/>
+      </w:pPr>
+    </w:p>
+    <w:p>
+      <w:r>
+        <w:rPr>
+          <w:rFonts w:ascii="Times New Roman" w:hAnsi="Times New Roman"/>
+          <w:b/>
+          <w:color w:val="1F498B"/>
+          <w:sz w:val="28"/>
+        </w:rPr>
+        <w:t xml:space="preserve">[Слайд 9]  </w:t>
+      </w:r>
+      <w:r>
+        <w:rPr>
+          <w:rFonts w:ascii="Times New Roman" w:hAnsi="Times New Roman"/>
+          <w:b/>
+          <w:color w:val="1F498B"/>
+          <w:sz w:val="28"/>
+        </w:rPr>
+        <w:t>Экономическое обоснование: ROMI 78,8%</w:t>
+      </w:r>
+    </w:p>
+    <w:p>
+      <w:pPr>
+        <w:spacing w:after="120"/>
+        <w:ind w:firstLine="709"/>
+        <w:jc w:val="both"/>
+      </w:pPr>
+      <w:r>
+        <w:rPr>
+          <w:rFonts w:ascii="Times New Roman" w:hAnsi="Times New Roman"/>
+          <w:sz w:val="28"/>
+        </w:rPr>
+        <w:t>Эффективность медиаплана рассчитана по трём сценариям. В реалистичном — базовом — сценарии прогнозируется рост числа входящих обращений в восемь раз: с трёх до двадцати пяти в месяц, заключение шести договоров в год и выручка по итогам 2026 года — 4 500 тысяч рублей. Рентабельность рекламной деятельности составит 78,8%, накопленный ROMI за два года — около плюс 57,5%, срок окупаемости — от 18 до 24 месяцев. Для B2B-рынка промышленного оборудования это приемлемый результат.</w:t>
+      </w:r>
+    </w:p>
+    <w:p>
+      <w:pPr>
+        <w:spacing w:after="120"/>
+        <w:ind w:firstLine="709"/>
+        <w:jc w:val="both"/>
+      </w:pPr>
+      <w:r>
+        <w:rPr>
+          <w:rFonts w:ascii="Times New Roman" w:hAnsi="Times New Roman"/>
+          <w:sz w:val="28"/>
+        </w:rPr>
+        <w:t>В оптимистичном сценарии выручка достигает 6 750 тысяч рублей при ROMI 145%. В пессимистичном — 2 250 тысяч рублей при ROMI 12,5% и окупаемости свыше 30 месяцев. При этом анализ чувствительности показал: медиаплан устойчив к умеренным отклонениям ключевых параметров, а критически важными оказались модернизация сайта и формирование референс-листа.</w:t>
+      </w:r>
+    </w:p>
+    <w:p>
+      <w:pPr>
+        <w:spacing w:after="0"/>
+      </w:pPr>
+    </w:p>
+    <w:p>
+      <w:r>
+        <w:rPr>
+          <w:rFonts w:ascii="Times New Roman" w:hAnsi="Times New Roman"/>
+          <w:b/>
+          <w:color w:val="1F498B"/>
+          <w:sz w:val="28"/>
+        </w:rPr>
+        <w:t xml:space="preserve">[Слайд 10–11]  </w:t>
+      </w:r>
+      <w:r>
+        <w:rPr>
+          <w:rFonts w:ascii="Times New Roman" w:hAnsi="Times New Roman"/>
+          <w:b/>
+          <w:color w:val="1F498B"/>
+          <w:sz w:val="28"/>
+        </w:rPr>
+        <w:t>Выводы и научная значимость</w:t>
+      </w:r>
+    </w:p>
+    <w:p>
+      <w:pPr>
+        <w:spacing w:after="120"/>
+        <w:ind w:firstLine="709"/>
+        <w:jc w:val="both"/>
+      </w:pPr>
+      <w:r>
+        <w:rPr>
+          <w:rFonts w:ascii="Times New Roman" w:hAnsi="Times New Roman"/>
+          <w:sz w:val="28"/>
+        </w:rPr>
+        <w:t>Позвольте подвести итоги. В ходе исследования доказано, что отсутствие системной рекламно-информационной работы является главной причиной сбытового кризиса ООО «ФАСТ ИНЖИНИРИНГ». Разработана комплексная программа из семи направлений и двенадцати мероприятий с бюджетом 2 миллиона рублей и расчётом отдачи по трём сценариям — всё это готово к внедрению в 2026 году.</w:t>
+      </w:r>
+    </w:p>
+    <w:p>
+      <w:pPr>
+        <w:spacing w:after="120"/>
+        <w:ind w:firstLine="709"/>
+        <w:jc w:val="both"/>
+      </w:pPr>
+      <w:r>
+        <w:rPr>
+          <w:rFonts w:ascii="Times New Roman" w:hAnsi="Times New Roman"/>
+          <w:sz w:val="28"/>
+        </w:rPr>
+        <w:t>Научная новизна работы состоит в авторской методике СИЭР — Сводного Индекса Эффективности Рекламно-информационной работы, которую можно применять не только в ООО «ФАСТ ИНЖИНИРИНГ», но и в других инжиниринговых микропредприятиях B2B-сегмента. Практическая ценность работы подтверждается готовностью всех разработанных инструментов — медиаплана, алгоритма аудита сайта и чек-листа барьеров — к немедленному применению.</w:t>
+      </w:r>
+    </w:p>
+    <w:p>
+      <w:pPr>
+        <w:spacing w:after="0"/>
+      </w:pPr>
     </w:p>
     <w:p>
       <w:pPr>
@@ -51,847 +544,7 @@
           <w:b/>
           <w:sz w:val="28"/>
         </w:rPr>
-        <w:t>(на примере ООО "ФАСТ ИНЖИНИРИНГ")»</w:t>
-      </w:r>
-    </w:p>
-    <w:p/>
-    <w:p>
-      <w:r>
-        <w:rPr>
-          <w:rFonts w:ascii="Times New Roman" w:hAnsi="Times New Roman"/>
-          <w:b/>
-          <w:color w:val="1F498B"/>
-          <w:sz w:val="28"/>
-        </w:rPr>
-        <w:t>[Слайд 1]</w:t>
-      </w:r>
-      <w:r>
-        <w:rPr>
-          <w:rFonts w:ascii="Times New Roman" w:hAnsi="Times New Roman"/>
-          <w:b/>
-          <w:color w:val="1F498B"/>
-          <w:sz w:val="28"/>
-        </w:rPr>
-        <w:t xml:space="preserve">  Титульный слайд</w:t>
-      </w:r>
-    </w:p>
-    <w:p>
-      <w:pPr>
-        <w:spacing w:after="80"/>
-        <w:ind w:firstLine="709"/>
-        <w:jc w:val="both"/>
-      </w:pPr>
-      <w:r>
-        <w:rPr>
-          <w:rFonts w:ascii="Times New Roman" w:hAnsi="Times New Roman"/>
-          <w:sz w:val="28"/>
-        </w:rPr>
-        <w:t>Уважаемый Председатель, уважаемые члены Государственной Аттестационной Комиссии!</w:t>
-      </w:r>
-    </w:p>
-    <w:p>
-      <w:pPr>
-        <w:spacing w:after="80"/>
-        <w:ind w:firstLine="709"/>
-        <w:jc w:val="both"/>
-      </w:pPr>
-      <w:r>
-        <w:rPr>
-          <w:rFonts w:ascii="Times New Roman" w:hAnsi="Times New Roman"/>
-          <w:sz w:val="28"/>
-        </w:rPr>
-        <w:t>Вашему вниманию представляется дипломная работа на тему: «Организация рекламно-информационной работы коммерческой организации и оценка её эффективности» — на примере ООО «ФАСТ ИНЖИНИРИНГ».</w:t>
-      </w:r>
-    </w:p>
-    <w:p>
-      <w:pPr>
-        <w:spacing w:after="80"/>
-        <w:ind w:firstLine="709"/>
-        <w:jc w:val="both"/>
-      </w:pPr>
-      <w:r>
-        <w:rPr>
-          <w:rFonts w:ascii="Times New Roman" w:hAnsi="Times New Roman"/>
-          <w:sz w:val="28"/>
-        </w:rPr>
-        <w:t>Научный руководитель — к.э.н., доцент Саенко Мария Юрьевна.</w:t>
-      </w:r>
-    </w:p>
-    <w:p/>
-    <w:p>
-      <w:r>
-        <w:rPr>
-          <w:rFonts w:ascii="Times New Roman" w:hAnsi="Times New Roman"/>
-          <w:b/>
-          <w:color w:val="1F498B"/>
-          <w:sz w:val="28"/>
-        </w:rPr>
-        <w:t>[Слайд 2]</w:t>
-      </w:r>
-      <w:r>
-        <w:rPr>
-          <w:rFonts w:ascii="Times New Roman" w:hAnsi="Times New Roman"/>
-          <w:b/>
-          <w:color w:val="1F498B"/>
-          <w:sz w:val="28"/>
-        </w:rPr>
-        <w:t xml:space="preserve">  Актуальность, цель и задачи</w:t>
-      </w:r>
-    </w:p>
-    <w:p>
-      <w:pPr>
-        <w:spacing w:after="80"/>
-        <w:ind w:firstLine="709"/>
-        <w:jc w:val="both"/>
-      </w:pPr>
-      <w:r>
-        <w:rPr>
-          <w:rFonts w:ascii="Times New Roman" w:hAnsi="Times New Roman"/>
-          <w:sz w:val="28"/>
-        </w:rPr>
-        <w:t>Почему эта тема важна? Три причины.</w:t>
-      </w:r>
-    </w:p>
-    <w:p>
-      <w:pPr>
-        <w:spacing w:after="80"/>
-        <w:ind w:firstLine="709"/>
-        <w:jc w:val="both"/>
-      </w:pPr>
-      <w:r>
-        <w:rPr>
-          <w:rFonts w:ascii="Times New Roman" w:hAnsi="Times New Roman"/>
-          <w:sz w:val="28"/>
-        </w:rPr>
-        <w:t>Первая — экономическая. Российские инжиниринговые компании сейчас на подъёме из-за курса на импортозамещение. Но хорошей продукции мало — её нужно ещё и продвигать.</w:t>
-      </w:r>
-    </w:p>
-    <w:p>
-      <w:pPr>
-        <w:spacing w:after="80"/>
-        <w:ind w:firstLine="709"/>
-        <w:jc w:val="both"/>
-      </w:pPr>
-      <w:r>
-        <w:rPr>
-          <w:rFonts w:ascii="Times New Roman" w:hAnsi="Times New Roman"/>
-          <w:sz w:val="28"/>
-        </w:rPr>
-        <w:t>Вторая — правовая. В 2022–2023 годах в закон «О рекламе» внесли серьёзные поправки: обязательная маркировка интернет-рекламы, Единый реестр. Это уже не опция, а требование.</w:t>
-      </w:r>
-    </w:p>
-    <w:p>
-      <w:pPr>
-        <w:spacing w:after="80"/>
-        <w:ind w:firstLine="709"/>
-        <w:jc w:val="both"/>
-      </w:pPr>
-      <w:r>
-        <w:rPr>
-          <w:rFonts w:ascii="Times New Roman" w:hAnsi="Times New Roman"/>
-          <w:sz w:val="28"/>
-        </w:rPr>
-        <w:t>Третья — научная. Для небольших B2B-компаний с долгим циклом сделки нормальной методики оценки рекламы практически нет. Мы её разработали.</w:t>
-      </w:r>
-    </w:p>
-    <w:p>
-      <w:pPr>
-        <w:spacing w:after="80"/>
-        <w:ind w:firstLine="709"/>
-        <w:jc w:val="both"/>
-      </w:pPr>
-      <w:r>
-        <w:rPr>
-          <w:rFonts w:ascii="Times New Roman" w:hAnsi="Times New Roman"/>
-          <w:sz w:val="28"/>
-        </w:rPr>
-        <w:t>Объект исследования — рекламно-информационная деятельность ООО «ФАСТ ИНЖИНИРИНГ». Цель — разработать конкретные предложения по её улучшению и посчитать, насколько они окупятся.</w:t>
-      </w:r>
-    </w:p>
-    <w:p/>
-    <w:p>
-      <w:r>
-        <w:rPr>
-          <w:rFonts w:ascii="Times New Roman" w:hAnsi="Times New Roman"/>
-          <w:b/>
-          <w:color w:val="1F498B"/>
-          <w:sz w:val="28"/>
-        </w:rPr>
-        <w:t>[Слайд 3]</w:t>
-      </w:r>
-      <w:r>
-        <w:rPr>
-          <w:rFonts w:ascii="Times New Roman" w:hAnsi="Times New Roman"/>
-          <w:b/>
-          <w:color w:val="1F498B"/>
-          <w:sz w:val="28"/>
-        </w:rPr>
-        <w:t xml:space="preserve">  Объект исследования — ООО «ФАСТ ИНЖИНИРИНГ»</w:t>
-      </w:r>
-    </w:p>
-    <w:p>
-      <w:pPr>
-        <w:spacing w:after="80"/>
-        <w:ind w:firstLine="709"/>
-        <w:jc w:val="both"/>
-      </w:pPr>
-      <w:r>
-        <w:rPr>
-          <w:rFonts w:ascii="Times New Roman" w:hAnsi="Times New Roman"/>
-          <w:sz w:val="28"/>
-        </w:rPr>
-        <w:t>Чем занимается компания? Это небольшое московское предприятие — до 10 человек. Разрабатывает и поставляет промышленное оборудование: теплообменники, массообменные аппараты, каталитические реакторы, беспламенные горелки.</w:t>
-      </w:r>
-    </w:p>
-    <w:p>
-      <w:pPr>
-        <w:spacing w:after="80"/>
-        <w:ind w:firstLine="709"/>
-        <w:jc w:val="both"/>
-      </w:pPr>
-      <w:r>
-        <w:rPr>
-          <w:rFonts w:ascii="Times New Roman" w:hAnsi="Times New Roman"/>
-          <w:sz w:val="28"/>
-        </w:rPr>
-        <w:t>Компания очень сильна технически. Все разработки запатентованы. Среди клиентов — НОВАТЭК, ЕВРОХИМ, ТАНЕКО, МОСЭНЕРГО. В 2026 году получила статус Малой технологической компании от Минэкономразвития. Лауреат премии «Новатор Москвы», финалист «Сколково».</w:t>
-      </w:r>
-    </w:p>
-    <w:p>
-      <w:pPr>
-        <w:spacing w:after="80"/>
-        <w:ind w:firstLine="709"/>
-        <w:jc w:val="both"/>
-      </w:pPr>
-      <w:r>
-        <w:rPr>
-          <w:rFonts w:ascii="Times New Roman" w:hAnsi="Times New Roman"/>
-          <w:sz w:val="28"/>
-        </w:rPr>
-        <w:t>Казалось бы — сильная компания. Но есть серьёзная проблема.</w:t>
-      </w:r>
-    </w:p>
-    <w:p/>
-    <w:p>
-      <w:r>
-        <w:rPr>
-          <w:rFonts w:ascii="Times New Roman" w:hAnsi="Times New Roman"/>
-          <w:b/>
-          <w:color w:val="1F498B"/>
-          <w:sz w:val="28"/>
-        </w:rPr>
-        <w:t>[Слайд 4]</w:t>
-      </w:r>
-      <w:r>
-        <w:rPr>
-          <w:rFonts w:ascii="Times New Roman" w:hAnsi="Times New Roman"/>
-          <w:b/>
-          <w:color w:val="1F498B"/>
-          <w:sz w:val="28"/>
-        </w:rPr>
-        <w:t xml:space="preserve">  Проблема: выручка упала на 80,4%</w:t>
-      </w:r>
-    </w:p>
-    <w:p>
-      <w:pPr>
-        <w:spacing w:after="80"/>
-        <w:ind w:firstLine="709"/>
-        <w:jc w:val="both"/>
-      </w:pPr>
-      <w:r>
-        <w:rPr>
-          <w:rFonts w:ascii="Times New Roman" w:hAnsi="Times New Roman"/>
-          <w:sz w:val="28"/>
-        </w:rPr>
-        <w:t>Смотрите на цифры. В 2023 году выручка — 5 605 тысяч рублей. В 2024 году — всего 375 тысяч. Падение в 15 раз. Прибыль — ноль. В 2025-м небольшое восстановление до 1 100 тысяч, но до уровня 2023 года ещё далеко.</w:t>
-      </w:r>
-    </w:p>
-    <w:p>
-      <w:pPr>
-        <w:spacing w:after="80"/>
-        <w:ind w:firstLine="709"/>
-        <w:jc w:val="both"/>
-      </w:pPr>
-      <w:r>
-        <w:rPr>
-          <w:rFonts w:ascii="Times New Roman" w:hAnsi="Times New Roman"/>
-          <w:sz w:val="28"/>
-        </w:rPr>
-        <w:t>Мы проверили: производство работает, люди на месте, патенты действуют. Значит, дело не в производстве. Дело в том, что компанию просто не знают и не находят.</w:t>
-      </w:r>
-    </w:p>
-    <w:p>
-      <w:pPr>
-        <w:spacing w:after="80"/>
-        <w:ind w:firstLine="709"/>
-        <w:jc w:val="both"/>
-      </w:pPr>
-      <w:r>
-        <w:rPr>
-          <w:rFonts w:ascii="Times New Roman" w:hAnsi="Times New Roman"/>
-          <w:sz w:val="28"/>
-        </w:rPr>
-        <w:t>Конкретные факты: узнаваемость в отрасли — 38%. Входящих обращений — около 3 в месяц. Используется только 2 маркетинговых инструмента из 6 возможных. Вывод: кризис — сбытовой, и его причина — в рекламе.</w:t>
-      </w:r>
-    </w:p>
-    <w:p/>
-    <w:p>
-      <w:r>
-        <w:rPr>
-          <w:rFonts w:ascii="Times New Roman" w:hAnsi="Times New Roman"/>
-          <w:b/>
-          <w:color w:val="1F498B"/>
-          <w:sz w:val="28"/>
-        </w:rPr>
-        <w:t>[Слайд 5]</w:t>
-      </w:r>
-      <w:r>
-        <w:rPr>
-          <w:rFonts w:ascii="Times New Roman" w:hAnsi="Times New Roman"/>
-          <w:b/>
-          <w:color w:val="1F498B"/>
-          <w:sz w:val="28"/>
-        </w:rPr>
-        <w:t xml:space="preserve">  SWOT-анализ</w:t>
-      </w:r>
-    </w:p>
-    <w:p>
-      <w:pPr>
-        <w:spacing w:after="80"/>
-        <w:ind w:firstLine="709"/>
-        <w:jc w:val="both"/>
-      </w:pPr>
-      <w:r>
-        <w:rPr>
-          <w:rFonts w:ascii="Times New Roman" w:hAnsi="Times New Roman"/>
-          <w:sz w:val="28"/>
-        </w:rPr>
-        <w:t>Мы провели SWOT-анализ рекламно-информационной работы.</w:t>
-      </w:r>
-    </w:p>
-    <w:p>
-      <w:pPr>
-        <w:spacing w:after="80"/>
-        <w:ind w:firstLine="709"/>
-        <w:jc w:val="both"/>
-      </w:pPr>
-      <w:r>
-        <w:rPr>
-          <w:rFonts w:ascii="Times New Roman" w:hAnsi="Times New Roman"/>
-          <w:sz w:val="28"/>
-        </w:rPr>
-        <w:t>Сильные стороны: уникальный продукт, патенты, крупные клиенты, премии и статусы. Слабые: нет маркетолога, сайт устаревший, нет CRM, нет референс-листа проектов, всё продвижение — через личные контакты директора.</w:t>
-      </w:r>
-    </w:p>
-    <w:p>
-      <w:pPr>
-        <w:spacing w:after="80"/>
-        <w:ind w:firstLine="709"/>
-        <w:jc w:val="both"/>
-      </w:pPr>
-      <w:r>
-        <w:rPr>
-          <w:rFonts w:ascii="Times New Roman" w:hAnsi="Times New Roman"/>
-          <w:sz w:val="28"/>
-        </w:rPr>
-        <w:t>Возможности: импортозамещение даёт рост спроса, цифровые каналы доступны — SEO, Яндекс.Директ, Telegram. Угрозы: конкуренция растёт, цикл сделки длинный, и если директор заболеет — заказов не будет вообще.</w:t>
-      </w:r>
-    </w:p>
-    <w:p/>
-    <w:p>
-      <w:r>
-        <w:rPr>
-          <w:rFonts w:ascii="Times New Roman" w:hAnsi="Times New Roman"/>
-          <w:b/>
-          <w:color w:val="1F498B"/>
-          <w:sz w:val="28"/>
-        </w:rPr>
-        <w:t>[Слайд 6]</w:t>
-      </w:r>
-      <w:r>
-        <w:rPr>
-          <w:rFonts w:ascii="Times New Roman" w:hAnsi="Times New Roman"/>
-          <w:b/>
-          <w:color w:val="1F498B"/>
-          <w:sz w:val="28"/>
-        </w:rPr>
-        <w:t xml:space="preserve">  5 барьеров, которые блокируют заказы</w:t>
-      </w:r>
-    </w:p>
-    <w:p>
-      <w:pPr>
-        <w:spacing w:after="80"/>
-        <w:ind w:firstLine="709"/>
-        <w:jc w:val="both"/>
-      </w:pPr>
-      <w:r>
-        <w:rPr>
-          <w:rFonts w:ascii="Times New Roman" w:hAnsi="Times New Roman"/>
-          <w:sz w:val="28"/>
-        </w:rPr>
-        <w:t>Мы выявили пять конкретных барьеров.</w:t>
-      </w:r>
-    </w:p>
-    <w:p>
-      <w:pPr>
-        <w:spacing w:after="80"/>
-        <w:ind w:firstLine="709"/>
-        <w:jc w:val="both"/>
-      </w:pPr>
-      <w:r>
-        <w:rPr>
-          <w:rFonts w:ascii="Times New Roman" w:hAnsi="Times New Roman"/>
-          <w:sz w:val="28"/>
-        </w:rPr>
-        <w:t>Барьер 1 — видимость. Только 38% нужной аудитории знают о компании. В поиске сайт не появляется.</w:t>
-      </w:r>
-    </w:p>
-    <w:p>
-      <w:pPr>
-        <w:spacing w:after="80"/>
-        <w:ind w:firstLine="709"/>
-        <w:jc w:val="both"/>
-      </w:pPr>
-      <w:r>
-        <w:rPr>
-          <w:rFonts w:ascii="Times New Roman" w:hAnsi="Times New Roman"/>
-          <w:sz w:val="28"/>
-        </w:rPr>
-        <w:t>Барьер 2 — доказательства. На сайте нет кейсов, нет отзывов клиентов. А в B2B без доказательств не покупают.</w:t>
-      </w:r>
-    </w:p>
-    <w:p>
-      <w:pPr>
-        <w:spacing w:after="80"/>
-        <w:ind w:firstLine="709"/>
-        <w:jc w:val="both"/>
-      </w:pPr>
-      <w:r>
-        <w:rPr>
-          <w:rFonts w:ascii="Times New Roman" w:hAnsi="Times New Roman"/>
-          <w:sz w:val="28"/>
-        </w:rPr>
-        <w:t>Барьер 3 — конвертация. Нет кнопки заявки, нет обратного звонка, нет CRM. Человек зашёл на сайт — и ушёл.</w:t>
-      </w:r>
-    </w:p>
-    <w:p>
-      <w:pPr>
-        <w:spacing w:after="80"/>
-        <w:ind w:firstLine="709"/>
-        <w:jc w:val="both"/>
-      </w:pPr>
-      <w:r>
-        <w:rPr>
-          <w:rFonts w:ascii="Times New Roman" w:hAnsi="Times New Roman"/>
-          <w:sz w:val="28"/>
-        </w:rPr>
-        <w:t>Барьер 4 — аналитика. Никаких метрик нет. Непонятно, что работает, а что нет.</w:t>
-      </w:r>
-    </w:p>
-    <w:p>
-      <w:pPr>
-        <w:spacing w:after="80"/>
-        <w:ind w:firstLine="709"/>
-        <w:jc w:val="both"/>
-      </w:pPr>
-      <w:r>
-        <w:rPr>
-          <w:rFonts w:ascii="Times New Roman" w:hAnsi="Times New Roman"/>
-          <w:sz w:val="28"/>
-        </w:rPr>
-        <w:t>Барьер 5 — масштабирование. Все продажи держатся на одном человеке. Нет воронки — нет системы.</w:t>
-      </w:r>
-    </w:p>
-    <w:p>
-      <w:pPr>
-        <w:spacing w:after="80"/>
-        <w:ind w:firstLine="709"/>
-        <w:jc w:val="both"/>
-      </w:pPr>
-      <w:r>
-        <w:rPr>
-          <w:rFonts w:ascii="Times New Roman" w:hAnsi="Times New Roman"/>
-          <w:sz w:val="28"/>
-        </w:rPr>
-        <w:t>Пока все пять барьеров не убраны — ситуация не изменится.</w:t>
-      </w:r>
-    </w:p>
-    <w:p/>
-    <w:p>
-      <w:r>
-        <w:rPr>
-          <w:rFonts w:ascii="Times New Roman" w:hAnsi="Times New Roman"/>
-          <w:b/>
-          <w:color w:val="1F498B"/>
-          <w:sz w:val="28"/>
-        </w:rPr>
-        <w:t>[Слайд 7]</w:t>
-      </w:r>
-      <w:r>
-        <w:rPr>
-          <w:rFonts w:ascii="Times New Roman" w:hAnsi="Times New Roman"/>
-          <w:b/>
-          <w:color w:val="1F498B"/>
-          <w:sz w:val="28"/>
-        </w:rPr>
-        <w:t xml:space="preserve">  7 направлений программы улучшения</w:t>
-      </w:r>
-    </w:p>
-    <w:p>
-      <w:pPr>
-        <w:spacing w:after="80"/>
-        <w:ind w:firstLine="709"/>
-        <w:jc w:val="both"/>
-      </w:pPr>
-      <w:r>
-        <w:rPr>
-          <w:rFonts w:ascii="Times New Roman" w:hAnsi="Times New Roman"/>
-          <w:sz w:val="28"/>
-        </w:rPr>
-        <w:t>В третьей главе мы разработали программу из семи шагов.</w:t>
-      </w:r>
-    </w:p>
-    <w:p>
-      <w:pPr>
-        <w:spacing w:after="80"/>
-        <w:ind w:firstLine="709"/>
-        <w:jc w:val="both"/>
-      </w:pPr>
-      <w:r>
-        <w:rPr>
-          <w:rFonts w:ascii="Times New Roman" w:hAnsi="Times New Roman"/>
-          <w:sz w:val="28"/>
-        </w:rPr>
-        <w:t>1. Написать маркетинговую стратегию — цели, KPI, бюджет.</w:t>
-      </w:r>
-    </w:p>
-    <w:p>
-      <w:pPr>
-        <w:spacing w:after="80"/>
-        <w:ind w:firstLine="709"/>
-        <w:jc w:val="both"/>
-      </w:pPr>
-      <w:r>
-        <w:rPr>
-          <w:rFonts w:ascii="Times New Roman" w:hAnsi="Times New Roman"/>
-          <w:sz w:val="28"/>
-        </w:rPr>
-        <w:t>2. Переделать сайт под B2B: добавить форму заявки, мобильную версию, отраслевые страницы.</w:t>
-      </w:r>
-    </w:p>
-    <w:p>
-      <w:pPr>
-        <w:spacing w:after="80"/>
-        <w:ind w:firstLine="709"/>
-        <w:jc w:val="both"/>
-      </w:pPr>
-      <w:r>
-        <w:rPr>
-          <w:rFonts w:ascii="Times New Roman" w:hAnsi="Times New Roman"/>
-          <w:sz w:val="28"/>
-        </w:rPr>
-        <w:t>3. Запустить SEO и рекламу в Яндекс.Директе — чтобы компанию находили в поиске.</w:t>
-      </w:r>
-    </w:p>
-    <w:p>
-      <w:pPr>
-        <w:spacing w:after="80"/>
-        <w:ind w:firstLine="709"/>
-        <w:jc w:val="both"/>
-      </w:pPr>
-      <w:r>
-        <w:rPr>
-          <w:rFonts w:ascii="Times New Roman" w:hAnsi="Times New Roman"/>
-          <w:sz w:val="28"/>
-        </w:rPr>
-        <w:t>4. Вести Telegram-канал — 1–2 экспертных поста в неделю.</w:t>
-      </w:r>
-    </w:p>
-    <w:p>
-      <w:pPr>
-        <w:spacing w:after="80"/>
-        <w:ind w:firstLine="709"/>
-        <w:jc w:val="both"/>
-      </w:pPr>
-      <w:r>
-        <w:rPr>
-          <w:rFonts w:ascii="Times New Roman" w:hAnsi="Times New Roman"/>
-          <w:sz w:val="28"/>
-        </w:rPr>
-        <w:t>5. Участвовать в 1–2 отраслевых выставках в год.</w:t>
-      </w:r>
-    </w:p>
-    <w:p>
-      <w:pPr>
-        <w:spacing w:after="80"/>
-        <w:ind w:firstLine="709"/>
-        <w:jc w:val="both"/>
-      </w:pPr>
-      <w:r>
-        <w:rPr>
-          <w:rFonts w:ascii="Times New Roman" w:hAnsi="Times New Roman"/>
-          <w:sz w:val="28"/>
-        </w:rPr>
-        <w:t>6. Внедрить CRM «Битрикс24» — считать лиды, вести аналитику.</w:t>
-      </w:r>
-    </w:p>
-    <w:p>
-      <w:pPr>
-        <w:spacing w:after="80"/>
-        <w:ind w:firstLine="709"/>
-        <w:jc w:val="both"/>
-      </w:pPr>
-      <w:r>
-        <w:rPr>
-          <w:rFonts w:ascii="Times New Roman" w:hAnsi="Times New Roman"/>
-          <w:sz w:val="28"/>
-        </w:rPr>
-        <w:t>7. Собрать референс-лист — реальные проекты с цифрами для заказчиков.</w:t>
-      </w:r>
-    </w:p>
-    <w:p>
-      <w:pPr>
-        <w:spacing w:after="80"/>
-        <w:ind w:firstLine="709"/>
-        <w:jc w:val="both"/>
-      </w:pPr>
-      <w:r>
-        <w:rPr>
-          <w:rFonts w:ascii="Times New Roman" w:hAnsi="Times New Roman"/>
-          <w:sz w:val="28"/>
-        </w:rPr>
-        <w:t>Каждый шаг убирает один или несколько из пяти барьеров.</w:t>
-      </w:r>
-    </w:p>
-    <w:p/>
-    <w:p>
-      <w:r>
-        <w:rPr>
-          <w:rFonts w:ascii="Times New Roman" w:hAnsi="Times New Roman"/>
-          <w:b/>
-          <w:color w:val="1F498B"/>
-          <w:sz w:val="28"/>
-        </w:rPr>
-        <w:t>[Слайд 8]</w:t>
-      </w:r>
-      <w:r>
-        <w:rPr>
-          <w:rFonts w:ascii="Times New Roman" w:hAnsi="Times New Roman"/>
-          <w:b/>
-          <w:color w:val="1F498B"/>
-          <w:sz w:val="28"/>
-        </w:rPr>
-        <w:t xml:space="preserve">  Медиаплан на 2026 год</w:t>
-      </w:r>
-    </w:p>
-    <w:p>
-      <w:pPr>
-        <w:spacing w:after="80"/>
-        <w:ind w:firstLine="709"/>
-        <w:jc w:val="both"/>
-      </w:pPr>
-      <w:r>
-        <w:rPr>
-          <w:rFonts w:ascii="Times New Roman" w:hAnsi="Times New Roman"/>
-          <w:sz w:val="28"/>
-        </w:rPr>
-        <w:t>На основе этих семи направлений составлен конкретный медиаплан: 12 мероприятий, расписанных по кварталам. Общий бюджет — 2 000 тысяч рублей.</w:t>
-      </w:r>
-    </w:p>
-    <w:p>
-      <w:pPr>
-        <w:spacing w:after="80"/>
-        <w:ind w:firstLine="709"/>
-        <w:jc w:val="both"/>
-      </w:pPr>
-      <w:r>
-        <w:rPr>
-          <w:rFonts w:ascii="Times New Roman" w:hAnsi="Times New Roman"/>
-          <w:sz w:val="28"/>
-        </w:rPr>
-        <w:t>Крупнейшие статьи расходов: Яндекс.Директ — 500 тысяч, CRM — 350 тысяч, SEO — 300 тысяч, выставка — 200 тысяч, сайт — 250 тысяч. Часть мероприятий — бесплатная: стратегия, подключение Яндекс.Метрики, референс-лист.</w:t>
-      </w:r>
-    </w:p>
-    <w:p/>
-    <w:p>
-      <w:r>
-        <w:rPr>
-          <w:rFonts w:ascii="Times New Roman" w:hAnsi="Times New Roman"/>
-          <w:b/>
-          <w:color w:val="1F498B"/>
-          <w:sz w:val="28"/>
-        </w:rPr>
-        <w:t>[Слайд 9]</w:t>
-      </w:r>
-      <w:r>
-        <w:rPr>
-          <w:rFonts w:ascii="Times New Roman" w:hAnsi="Times New Roman"/>
-          <w:b/>
-          <w:color w:val="1F498B"/>
-          <w:sz w:val="28"/>
-        </w:rPr>
-        <w:t xml:space="preserve">  Окупаемость: ROMI 78,8%</w:t>
-      </w:r>
-    </w:p>
-    <w:p>
-      <w:pPr>
-        <w:spacing w:after="80"/>
-        <w:ind w:firstLine="709"/>
-        <w:jc w:val="both"/>
-      </w:pPr>
-      <w:r>
-        <w:rPr>
-          <w:rFonts w:ascii="Times New Roman" w:hAnsi="Times New Roman"/>
-          <w:sz w:val="28"/>
-        </w:rPr>
-        <w:t>Теперь о деньгах. Мы посчитали три сценария.</w:t>
-      </w:r>
-    </w:p>
-    <w:p>
-      <w:pPr>
-        <w:spacing w:after="80"/>
-        <w:ind w:firstLine="709"/>
-        <w:jc w:val="both"/>
-      </w:pPr>
-      <w:r>
-        <w:rPr>
-          <w:rFonts w:ascii="Times New Roman" w:hAnsi="Times New Roman"/>
-          <w:sz w:val="28"/>
-        </w:rPr>
-        <w:t>Реалистичный — базовый. Обращений станет в 8 раз больше: с 3 до 25 в месяц. Будет заключено 6 договоров в год. Выручка в 2026 году — 4 500 тысяч рублей. Рентабельность рекламы — 78,8%. Вложения окупятся за 18–24 месяца.</w:t>
-      </w:r>
-    </w:p>
-    <w:p>
-      <w:pPr>
-        <w:spacing w:after="80"/>
-        <w:ind w:firstLine="709"/>
-        <w:jc w:val="both"/>
-      </w:pPr>
-      <w:r>
-        <w:rPr>
-          <w:rFonts w:ascii="Times New Roman" w:hAnsi="Times New Roman"/>
-          <w:sz w:val="28"/>
-        </w:rPr>
-        <w:t>Оптимистичный: выручка 6 750 тысяч рублей, ROMI — 145%, окупаемость — 12–15 месяцев.</w:t>
-      </w:r>
-    </w:p>
-    <w:p>
-      <w:pPr>
-        <w:spacing w:after="80"/>
-        <w:ind w:firstLine="709"/>
-        <w:jc w:val="both"/>
-      </w:pPr>
-      <w:r>
-        <w:rPr>
-          <w:rFonts w:ascii="Times New Roman" w:hAnsi="Times New Roman"/>
-          <w:sz w:val="28"/>
-        </w:rPr>
-        <w:t>Пессимистичный: выручка 2 250 тысяч рублей, ROMI — 12,5%, окупаемость — больше 30 месяцев.</w:t>
-      </w:r>
-    </w:p>
-    <w:p>
-      <w:pPr>
-        <w:spacing w:after="80"/>
-        <w:ind w:firstLine="709"/>
-        <w:jc w:val="both"/>
-      </w:pPr>
-      <w:r>
-        <w:rPr>
-          <w:rFonts w:ascii="Times New Roman" w:hAnsi="Times New Roman"/>
-          <w:sz w:val="28"/>
-        </w:rPr>
-        <w:t>Даже в худшем варианте инвестиции не сгорают — они просто окупаются дольше.</w:t>
-      </w:r>
-    </w:p>
-    <w:p/>
-    <w:p>
-      <w:r>
-        <w:rPr>
-          <w:rFonts w:ascii="Times New Roman" w:hAnsi="Times New Roman"/>
-          <w:b/>
-          <w:color w:val="1F498B"/>
-          <w:sz w:val="28"/>
-        </w:rPr>
-        <w:t>[Слайд 10–11]</w:t>
-      </w:r>
-      <w:r>
-        <w:rPr>
-          <w:rFonts w:ascii="Times New Roman" w:hAnsi="Times New Roman"/>
-          <w:b/>
-          <w:color w:val="1F498B"/>
-          <w:sz w:val="28"/>
-        </w:rPr>
-        <w:t xml:space="preserve">  Выводы</w:t>
-      </w:r>
-    </w:p>
-    <w:p>
-      <w:pPr>
-        <w:spacing w:after="80"/>
-        <w:ind w:firstLine="709"/>
-        <w:jc w:val="both"/>
-      </w:pPr>
-      <w:r>
-        <w:rPr>
-          <w:rFonts w:ascii="Times New Roman" w:hAnsi="Times New Roman"/>
-          <w:sz w:val="28"/>
-        </w:rPr>
-        <w:t>Подведу итог.</w:t>
-      </w:r>
-    </w:p>
-    <w:p>
-      <w:pPr>
-        <w:spacing w:after="80"/>
-        <w:ind w:firstLine="709"/>
-        <w:jc w:val="both"/>
-      </w:pPr>
-      <w:r>
-        <w:rPr>
-          <w:rFonts w:ascii="Times New Roman" w:hAnsi="Times New Roman"/>
-          <w:sz w:val="28"/>
-        </w:rPr>
-        <w:t>Первое — мы доказали: главная причина сбытового кризиса — отсутствие системной рекламно-информационной работы. Не производство, не продукт — а реклама.</w:t>
-      </w:r>
-    </w:p>
-    <w:p>
-      <w:pPr>
-        <w:spacing w:after="80"/>
-        <w:ind w:firstLine="709"/>
-        <w:jc w:val="both"/>
-      </w:pPr>
-      <w:r>
-        <w:rPr>
-          <w:rFonts w:ascii="Times New Roman" w:hAnsi="Times New Roman"/>
-          <w:sz w:val="28"/>
-        </w:rPr>
-        <w:t>Второе — мы разработали конкретную программу: 7 направлений, 12 мероприятий, бюджет 2 миллиона рублей. Всё готово к внедрению в 2026 году.</w:t>
-      </w:r>
-    </w:p>
-    <w:p>
-      <w:pPr>
-        <w:spacing w:after="80"/>
-        <w:ind w:firstLine="709"/>
-        <w:jc w:val="both"/>
-      </w:pPr>
-      <w:r>
-        <w:rPr>
-          <w:rFonts w:ascii="Times New Roman" w:hAnsi="Times New Roman"/>
-          <w:sz w:val="28"/>
-        </w:rPr>
-        <w:t>Третье — предложена авторская методика СИЭР — Сводный Индекс Эффективности Рекламно-информационной работы. Её можно применять и в других инжиниринговых компаниях.</w:t>
-      </w:r>
-    </w:p>
-    <w:p/>
-    <w:p>
-      <w:pPr>
-        <w:jc w:val="center"/>
-      </w:pPr>
-      <w:r>
-        <w:rPr>
-          <w:rFonts w:ascii="Times New Roman" w:hAnsi="Times New Roman"/>
-          <w:b/>
-          <w:sz w:val="28"/>
-        </w:rPr>
-        <w:t>Доклад завершён. Готов ответить на ваши вопросы.</w:t>
+        <w:t>Доклад завершён. Готов ответить на вопросы.</w:t>
       </w:r>
     </w:p>
     <w:p>
@@ -904,7 +557,7 @@
           <w:i/>
           <w:sz w:val="24"/>
         </w:rPr>
-        <w:t>Время доклада: ~7 минут</w:t>
+        <w:t>Расчётное время доклада: ~7 минут</w:t>
       </w:r>
     </w:p>
     <w:sectPr>

</xml_diff>